<commit_message>
feat: add session-aware library workflows
</commit_message>
<xml_diff>
--- a/docs/SkillsForge-documentary.docx
+++ b/docs/SkillsForge-documentary.docx
@@ -4,10 +4,11 @@
   <w:body>
     <w:p>
       <w:pPr>
-        <w:jc w:val="center"/>
+        <w:spacing w:after="60"/>
       </w:pPr>
       <w:r>
         <w:rPr>
+          <w:rFonts w:ascii="Calibri" w:hAnsi="Calibri"/>
           <w:b/>
           <w:color w:val="0B2545"/>
           <w:sz w:val="48"/>
@@ -17,92 +18,14 @@
     </w:p>
     <w:p>
       <w:pPr>
-        <w:jc w:val="center"/>
+        <w:spacing w:after="240"/>
       </w:pPr>
       <w:r>
         <w:rPr>
-          <w:color w:val="1F4D78"/>
-          <w:sz w:val="26"/>
+          <w:color w:val="555555"/>
+          <w:sz w:val="22"/>
         </w:rPr>
-        <w:t>From trust idea to universal AI CLI skill pipeline</w:t>
-      </w:r>
-    </w:p>
-    <w:p>
-      <w:pPr>
-        <w:jc w:val="center"/>
-      </w:pPr>
-      <w:r>
-        <w:t>Repository: C:\Users\USER\Desktop\vibecoded\skillsforge</w:t>
-        <w:br/>
-      </w:r>
-      <w:r>
-        <w:t>Branch: codex/hackathon-hardening-architecture</w:t>
-        <w:br/>
-      </w:r>
-      <w:r>
-        <w:t>Version: 0.4.0</w:t>
-        <w:br/>
-      </w:r>
-      <w:r>
-        <w:t>Date: 2026-07-18</w:t>
-      </w:r>
-    </w:p>
-    <w:p/>
-    <w:p>
-      <w:pPr>
-        <w:jc w:val="center"/>
-      </w:pPr>
-      <w:r>
-        <w:drawing>
-          <wp:inline xmlns:a="http://schemas.openxmlformats.org/drawingml/2006/main" xmlns:pic="http://schemas.openxmlformats.org/drawingml/2006/picture">
-            <wp:extent cx="5394960" cy="3034665"/>
-            <wp:docPr id="1" name="Picture 1"/>
-            <wp:cNvGraphicFramePr>
-              <a:graphicFrameLocks noChangeAspect="1"/>
-            </wp:cNvGraphicFramePr>
-            <a:graphic>
-              <a:graphicData uri="http://schemas.openxmlformats.org/drawingml/2006/picture">
-                <pic:pic>
-                  <pic:nvPicPr>
-                    <pic:cNvPr id="0" name="skillsforge-demo-poster.png"/>
-                    <pic:cNvPicPr/>
-                  </pic:nvPicPr>
-                  <pic:blipFill>
-                    <a:blip r:embed="rId11"/>
-                    <a:stretch>
-                      <a:fillRect/>
-                    </a:stretch>
-                  </pic:blipFill>
-                  <pic:spPr>
-                    <a:xfrm>
-                      <a:off x="0" y="0"/>
-                      <a:ext cx="5394960" cy="3034665"/>
-                    </a:xfrm>
-                    <a:prstGeom prst="rect"/>
-                  </pic:spPr>
-                </pic:pic>
-              </a:graphicData>
-            </a:graphic>
-          </wp:inline>
-        </w:drawing>
-      </w:r>
-    </w:p>
-    <w:p>
-      <w:r>
-        <w:br w:type="page"/>
-      </w:r>
-    </w:p>
-    <w:p>
-      <w:pPr>
-        <w:pStyle w:val="Heading1"/>
-      </w:pPr>
-      <w:r>
-        <w:t>1. Executive brief</w:t>
-      </w:r>
-    </w:p>
-    <w:p>
-      <w:r>
-        <w:t>SkillsForge is a trust and routing layer for portable Agent Skills. The project validates skill structure, scans declared capabilities, fails closed on unsafe examples, packages one safe skill into a guarded Codex plugin, installs validated packages into multiple AI CLI skill roots, and emits evidence receipts for packaged bytes.</w:t>
+        <w:t>From trust idea to shipped universal AI CLI skill workbench - 2026-07-18</w:t>
       </w:r>
     </w:p>
     <w:tbl>
@@ -110,7 +33,6 @@
         <w:tblStyle w:val="TableGrid"/>
         <w:tblW w:type="auto" w:w="0"/>
         <w:jc w:val="left"/>
-        <w:tblLayout w:type="fixed"/>
         <w:tblLook w:firstColumn="1" w:firstRow="1" w:lastColumn="0" w:lastRow="0" w:noHBand="0" w:noVBand="1" w:val="04A0"/>
       </w:tblPr>
       <w:tblGrid>
@@ -121,19 +43,19 @@
         <w:tc>
           <w:tcPr>
             <w:tcW w:type="dxa" w:w="2592"/>
+            <w:shd w:fill="E8EEF5"/>
+            <w:tcMar>
+              <w:top w:w="80" w:type="dxa"/>
+              <w:start w:w="120" w:type="dxa"/>
+              <w:bottom w:w="80" w:type="dxa"/>
+              <w:end w:w="120" w:type="dxa"/>
+            </w:tcMar>
             <w:vAlign w:val="center"/>
-            <w:shd w:fill="F2F4F7"/>
           </w:tcPr>
           <w:p>
-            <w:pPr>
-              <w:spacing w:after="60"/>
-            </w:pPr>
             <w:r>
               <w:rPr>
-                <w:rFonts w:ascii="Calibri" w:hAnsi="Calibri"/>
                 <w:b/>
-                <w:color w:val="0B2545"/>
-                <w:sz w:val="20"/>
               </w:rPr>
               <w:t>Field</w:t>
             </w:r>
@@ -142,19 +64,19 @@
         <w:tc>
           <w:tcPr>
             <w:tcW w:type="dxa" w:w="6768"/>
+            <w:shd w:fill="E8EEF5"/>
+            <w:tcMar>
+              <w:top w:w="80" w:type="dxa"/>
+              <w:start w:w="120" w:type="dxa"/>
+              <w:bottom w:w="80" w:type="dxa"/>
+              <w:end w:w="120" w:type="dxa"/>
+            </w:tcMar>
             <w:vAlign w:val="center"/>
-            <w:shd w:fill="F2F4F7"/>
           </w:tcPr>
           <w:p>
-            <w:pPr>
-              <w:spacing w:after="60"/>
-            </w:pPr>
             <w:r>
               <w:rPr>
-                <w:rFonts w:ascii="Calibri" w:hAnsi="Calibri"/>
                 <w:b/>
-                <w:color w:val="0B2545"/>
-                <w:sz w:val="20"/>
               </w:rPr>
               <w:t>Value</w:t>
             </w:r>
@@ -165,36 +87,34 @@
         <w:tc>
           <w:tcPr>
             <w:tcW w:type="dxa" w:w="2592"/>
+            <w:tcMar>
+              <w:top w:w="80" w:type="dxa"/>
+              <w:start w:w="120" w:type="dxa"/>
+              <w:bottom w:w="80" w:type="dxa"/>
+              <w:end w:w="120" w:type="dxa"/>
+            </w:tcMar>
             <w:vAlign w:val="center"/>
           </w:tcPr>
           <w:p>
-            <w:pPr>
-              <w:spacing w:after="60"/>
-            </w:pPr>
             <w:r>
-              <w:rPr>
-                <w:rFonts w:ascii="Calibri" w:hAnsi="Calibri"/>
-                <w:sz w:val="20"/>
-              </w:rPr>
-              <w:t>Primary target</w:t>
+              <w:t>Repository</w:t>
             </w:r>
           </w:p>
         </w:tc>
         <w:tc>
           <w:tcPr>
             <w:tcW w:type="dxa" w:w="6768"/>
+            <w:tcMar>
+              <w:top w:w="80" w:type="dxa"/>
+              <w:start w:w="120" w:type="dxa"/>
+              <w:bottom w:w="80" w:type="dxa"/>
+              <w:end w:w="120" w:type="dxa"/>
+            </w:tcMar>
             <w:vAlign w:val="center"/>
           </w:tcPr>
           <w:p>
-            <w:pPr>
-              <w:spacing w:after="60"/>
-            </w:pPr>
             <w:r>
-              <w:rPr>
-                <w:rFonts w:ascii="Calibri" w:hAnsi="Calibri"/>
-                <w:sz w:val="20"/>
-              </w:rPr>
-              <w:t>Codex native plugin and guarded one-skill package</w:t>
+              <w:t>C:\Users\USER\Desktop\vibecoded\skillsforge</w:t>
             </w:r>
           </w:p>
         </w:tc>
@@ -203,36 +123,34 @@
         <w:tc>
           <w:tcPr>
             <w:tcW w:type="dxa" w:w="2592"/>
+            <w:tcMar>
+              <w:top w:w="80" w:type="dxa"/>
+              <w:start w:w="120" w:type="dxa"/>
+              <w:bottom w:w="80" w:type="dxa"/>
+              <w:end w:w="120" w:type="dxa"/>
+            </w:tcMar>
             <w:vAlign w:val="center"/>
           </w:tcPr>
           <w:p>
-            <w:pPr>
-              <w:spacing w:after="60"/>
-            </w:pPr>
             <w:r>
-              <w:rPr>
-                <w:rFonts w:ascii="Calibri" w:hAnsi="Calibri"/>
-                <w:sz w:val="20"/>
-              </w:rPr>
-              <w:t>Second target</w:t>
+              <w:t>Branch</w:t>
             </w:r>
           </w:p>
         </w:tc>
         <w:tc>
           <w:tcPr>
             <w:tcW w:type="dxa" w:w="6768"/>
+            <w:tcMar>
+              <w:top w:w="80" w:type="dxa"/>
+              <w:start w:w="120" w:type="dxa"/>
+              <w:bottom w:w="80" w:type="dxa"/>
+              <w:end w:w="120" w:type="dxa"/>
+            </w:tcMar>
             <w:vAlign w:val="center"/>
           </w:tcPr>
           <w:p>
-            <w:pPr>
-              <w:spacing w:after="60"/>
-            </w:pPr>
             <w:r>
-              <w:rPr>
-                <w:rFonts w:ascii="Calibri" w:hAnsi="Calibri"/>
-                <w:sz w:val="20"/>
-              </w:rPr>
-              <w:t>Claude Code full-fidelity install with hooks and sidecar</w:t>
+              <w:t>codex/hackathon-hardening-architecture</w:t>
             </w:r>
           </w:p>
         </w:tc>
@@ -241,36 +159,34 @@
         <w:tc>
           <w:tcPr>
             <w:tcW w:type="dxa" w:w="2592"/>
+            <w:tcMar>
+              <w:top w:w="80" w:type="dxa"/>
+              <w:start w:w="120" w:type="dxa"/>
+              <w:bottom w:w="80" w:type="dxa"/>
+              <w:end w:w="120" w:type="dxa"/>
+            </w:tcMar>
             <w:vAlign w:val="center"/>
           </w:tcPr>
           <w:p>
-            <w:pPr>
-              <w:spacing w:after="60"/>
-            </w:pPr>
             <w:r>
-              <w:rPr>
-                <w:rFonts w:ascii="Calibri" w:hAnsi="Calibri"/>
-                <w:sz w:val="20"/>
-              </w:rPr>
-              <w:t>Package-fidelity targets</w:t>
+              <w:t>Version</w:t>
             </w:r>
           </w:p>
         </w:tc>
         <w:tc>
           <w:tcPr>
             <w:tcW w:type="dxa" w:w="6768"/>
+            <w:tcMar>
+              <w:top w:w="80" w:type="dxa"/>
+              <w:start w:w="120" w:type="dxa"/>
+              <w:bottom w:w="80" w:type="dxa"/>
+              <w:end w:w="120" w:type="dxa"/>
+            </w:tcMar>
             <w:vAlign w:val="center"/>
           </w:tcPr>
           <w:p>
-            <w:pPr>
-              <w:spacing w:after="60"/>
-            </w:pPr>
             <w:r>
-              <w:rPr>
-                <w:rFonts w:ascii="Calibri" w:hAnsi="Calibri"/>
-                <w:sz w:val="20"/>
-              </w:rPr>
-              <w:t>Cursor, OpenCode, ZCode, Hermes, Gemini, plus custom local AI CLI skill directories</w:t>
+              <w:t>0.4.0</w:t>
             </w:r>
           </w:p>
         </w:tc>
@@ -279,36 +195,34 @@
         <w:tc>
           <w:tcPr>
             <w:tcW w:type="dxa" w:w="2592"/>
+            <w:tcMar>
+              <w:top w:w="80" w:type="dxa"/>
+              <w:start w:w="120" w:type="dxa"/>
+              <w:bottom w:w="80" w:type="dxa"/>
+              <w:end w:w="120" w:type="dxa"/>
+            </w:tcMar>
             <w:vAlign w:val="center"/>
           </w:tcPr>
           <w:p>
-            <w:pPr>
-              <w:spacing w:after="60"/>
-            </w:pPr>
             <w:r>
-              <w:rPr>
-                <w:rFonts w:ascii="Calibri" w:hAnsi="Calibri"/>
-                <w:sz w:val="20"/>
-              </w:rPr>
-              <w:t>Catalog verified locally</w:t>
+              <w:t>Design preset</w:t>
             </w:r>
           </w:p>
         </w:tc>
         <w:tc>
           <w:tcPr>
             <w:tcW w:type="dxa" w:w="6768"/>
+            <w:tcMar>
+              <w:top w:w="80" w:type="dxa"/>
+              <w:start w:w="120" w:type="dxa"/>
+              <w:bottom w:w="80" w:type="dxa"/>
+              <w:end w:w="120" w:type="dxa"/>
+            </w:tcMar>
             <w:vAlign w:val="center"/>
           </w:tcPr>
           <w:p>
-            <w:pPr>
-              <w:spacing w:after="60"/>
-            </w:pPr>
             <w:r>
-              <w:rPr>
-                <w:rFonts w:ascii="Calibri" w:hAnsi="Calibri"/>
-                <w:sz w:val="20"/>
-              </w:rPr>
-              <w:t>366 skills, 26 packs, 10 profiles</w:t>
+              <w:t>compact_reference_guide</w:t>
             </w:r>
           </w:p>
         </w:tc>
@@ -317,36 +231,34 @@
         <w:tc>
           <w:tcPr>
             <w:tcW w:type="dxa" w:w="2592"/>
+            <w:tcMar>
+              <w:top w:w="80" w:type="dxa"/>
+              <w:start w:w="120" w:type="dxa"/>
+              <w:bottom w:w="80" w:type="dxa"/>
+              <w:end w:w="120" w:type="dxa"/>
+            </w:tcMar>
             <w:vAlign w:val="center"/>
           </w:tcPr>
           <w:p>
-            <w:pPr>
-              <w:spacing w:after="60"/>
-            </w:pPr>
             <w:r>
-              <w:rPr>
-                <w:rFonts w:ascii="Calibri" w:hAnsi="Calibri"/>
-                <w:sz w:val="20"/>
-              </w:rPr>
-              <w:t>Agent and command inventory</w:t>
+              <w:t>Primary target</w:t>
             </w:r>
           </w:p>
         </w:tc>
         <w:tc>
           <w:tcPr>
             <w:tcW w:type="dxa" w:w="6768"/>
+            <w:tcMar>
+              <w:top w:w="80" w:type="dxa"/>
+              <w:start w:w="120" w:type="dxa"/>
+              <w:bottom w:w="80" w:type="dxa"/>
+              <w:end w:w="120" w:type="dxa"/>
+            </w:tcMar>
             <w:vAlign w:val="center"/>
           </w:tcPr>
           <w:p>
-            <w:pPr>
-              <w:spacing w:after="60"/>
-            </w:pPr>
             <w:r>
-              <w:rPr>
-                <w:rFonts w:ascii="Calibri" w:hAnsi="Calibri"/>
-                <w:sz w:val="20"/>
-              </w:rPr>
-              <w:t>74 agent files, 119 command files</w:t>
+              <w:t>Codex native plugin and guarded package path</w:t>
             </w:r>
           </w:p>
         </w:tc>
@@ -355,36 +267,34 @@
         <w:tc>
           <w:tcPr>
             <w:tcW w:type="dxa" w:w="2592"/>
+            <w:tcMar>
+              <w:top w:w="80" w:type="dxa"/>
+              <w:start w:w="120" w:type="dxa"/>
+              <w:bottom w:w="80" w:type="dxa"/>
+              <w:end w:w="120" w:type="dxa"/>
+            </w:tcMar>
             <w:vAlign w:val="center"/>
           </w:tcPr>
           <w:p>
-            <w:pPr>
-              <w:spacing w:after="60"/>
-            </w:pPr>
             <w:r>
-              <w:rPr>
-                <w:rFonts w:ascii="Calibri" w:hAnsi="Calibri"/>
-                <w:sz w:val="20"/>
-              </w:rPr>
-              <w:t>Rollback checkpoint</w:t>
+              <w:t>Second target</w:t>
             </w:r>
           </w:p>
         </w:tc>
         <w:tc>
           <w:tcPr>
             <w:tcW w:type="dxa" w:w="6768"/>
+            <w:tcMar>
+              <w:top w:w="80" w:type="dxa"/>
+              <w:start w:w="120" w:type="dxa"/>
+              <w:bottom w:w="80" w:type="dxa"/>
+              <w:end w:w="120" w:type="dxa"/>
+            </w:tcMar>
             <w:vAlign w:val="center"/>
           </w:tcPr>
           <w:p>
-            <w:pPr>
-              <w:spacing w:after="60"/>
-            </w:pPr>
             <w:r>
-              <w:rPr>
-                <w:rFonts w:ascii="Calibri" w:hAnsi="Calibri"/>
-                <w:sz w:val="20"/>
-              </w:rPr>
-              <w:t>Commit 960125a: feat: harden hackathon ship surface</w:t>
+              <w:t>Claude Code full-fidelity install</w:t>
             </w:r>
           </w:p>
         </w:tc>
@@ -396,30 +306,17 @@
         <w:pStyle w:val="Heading1"/>
       </w:pPr>
       <w:r>
-        <w:t>2. Problem</w:t>
+        <w:t>1. Executive Brief</w:t>
       </w:r>
     </w:p>
     <w:p>
       <w:r>
-        <w:t>Agent Skills are useful because they package repeatable work. The risk is that a skill can also carry undeclared shell commands, network references, write paths, scripts, or opaque files. A catalog can look impressive while still leaving operators unable to answer what a skill can do, whether it can be safely installed, and whether the packaged bytes changed later.</w:t>
+        <w:t>SkillsForge is a trust and routing layer for portable Agent Skills. The product validates skill structure, scans declared capabilities, blocks unsafe examples before execution, packages safe skills into guarded Codex plugin trees, installs package-fidelity skills across local AI CLI hosts, and emits evidence receipts for packaged bytes.</w:t>
       </w:r>
     </w:p>
     <w:p>
       <w:r>
-        <w:t>The project goal is not to claim an OS sandbox or universal host control. The goal is narrower and testable: make skill packages reviewable, least-privilege, packageable, and tamper-evident.</w:t>
-      </w:r>
-    </w:p>
-    <w:p>
-      <w:pPr>
-        <w:pStyle w:val="Heading1"/>
-      </w:pPr>
-      <w:r>
-        <w:t>3. Why build this when other packs exist</w:t>
-      </w:r>
-    </w:p>
-    <w:p>
-      <w:r>
-        <w:t>Existing skill ecosystems help with discovery, workflows, and role coverage. SkillsForge focuses on the trust gap around those workflows. The value proposition is: most skill packs solve discovery; SkillsForge solves trust.</w:t>
+        <w:t>This hardening pass expanded the project from a Codex-first trust demo into a universal local developer tool for AI agents and vibecoders. It kept the runtime in Node 20 ESM, avoided Rust and heavyweight frontend frameworks, and focused on compact PowerShell-friendly commands, local library indexing, workflow recommendation, and honest trust boundaries.</w:t>
       </w:r>
     </w:p>
     <w:tbl>
@@ -427,75 +324,52 @@
         <w:tblStyle w:val="TableGrid"/>
         <w:tblW w:type="auto" w:w="0"/>
         <w:jc w:val="left"/>
-        <w:tblLayout w:type="fixed"/>
         <w:tblLook w:firstColumn="1" w:firstRow="1" w:lastColumn="0" w:lastRow="0" w:noHBand="0" w:noVBand="1" w:val="04A0"/>
       </w:tblPr>
       <w:tblGrid>
-        <w:gridCol w:w="3120"/>
-        <w:gridCol w:w="3120"/>
-        <w:gridCol w:w="3120"/>
+        <w:gridCol w:w="4680"/>
+        <w:gridCol w:w="4680"/>
       </w:tblGrid>
       <w:tr>
         <w:tc>
           <w:tcPr>
-            <w:tcW w:type="dxa" w:w="2232"/>
+            <w:tcW w:type="dxa" w:w="3168"/>
+            <w:shd w:fill="E8EEF5"/>
+            <w:tcMar>
+              <w:top w:w="80" w:type="dxa"/>
+              <w:start w:w="120" w:type="dxa"/>
+              <w:bottom w:w="80" w:type="dxa"/>
+              <w:end w:w="120" w:type="dxa"/>
+            </w:tcMar>
             <w:vAlign w:val="center"/>
-            <w:shd w:fill="F2F4F7"/>
           </w:tcPr>
           <w:p>
-            <w:pPr>
-              <w:spacing w:after="60"/>
-            </w:pPr>
             <w:r>
               <w:rPr>
-                <w:rFonts w:ascii="Calibri" w:hAnsi="Calibri"/>
                 <w:b/>
-                <w:color w:val="0B2545"/>
-                <w:sz w:val="20"/>
               </w:rPr>
-              <w:t>Reference surface</w:t>
+              <w:t>Inventory</w:t>
             </w:r>
           </w:p>
         </w:tc>
         <w:tc>
           <w:tcPr>
-            <w:tcW w:type="dxa" w:w="3168"/>
+            <w:tcW w:type="dxa" w:w="6192"/>
+            <w:shd w:fill="E8EEF5"/>
+            <w:tcMar>
+              <w:top w:w="80" w:type="dxa"/>
+              <w:start w:w="120" w:type="dxa"/>
+              <w:bottom w:w="80" w:type="dxa"/>
+              <w:end w:w="120" w:type="dxa"/>
+            </w:tcMar>
             <w:vAlign w:val="center"/>
-            <w:shd w:fill="F2F4F7"/>
           </w:tcPr>
           <w:p>
-            <w:pPr>
-              <w:spacing w:after="60"/>
-            </w:pPr>
             <w:r>
               <w:rPr>
-                <w:rFonts w:ascii="Calibri" w:hAnsi="Calibri"/>
                 <w:b/>
-                <w:color w:val="0B2545"/>
-                <w:sz w:val="20"/>
               </w:rPr>
-              <w:t>Useful strength</w:t>
-            </w:r>
-          </w:p>
-        </w:tc>
-        <w:tc>
-          <w:tcPr>
-            <w:tcW w:type="dxa" w:w="3960"/>
-            <w:vAlign w:val="center"/>
-            <w:shd w:fill="F2F4F7"/>
-          </w:tcPr>
-          <w:p>
-            <w:pPr>
-              <w:spacing w:after="60"/>
-            </w:pPr>
-            <w:r>
-              <w:rPr>
-                <w:rFonts w:ascii="Calibri" w:hAnsi="Calibri"/>
-                <w:b/>
-                <w:color w:val="0B2545"/>
-                <w:sz w:val="20"/>
-              </w:rPr>
-              <w:t>SkillsForge addition</w:t>
+              <w:t>Verified local value</w:t>
             </w:r>
           </w:p>
         </w:tc>
@@ -503,55 +377,35 @@
       <w:tr>
         <w:tc>
           <w:tcPr>
-            <w:tcW w:type="dxa" w:w="2232"/>
+            <w:tcW w:type="dxa" w:w="3168"/>
+            <w:tcMar>
+              <w:top w:w="80" w:type="dxa"/>
+              <w:start w:w="120" w:type="dxa"/>
+              <w:bottom w:w="80" w:type="dxa"/>
+              <w:end w:w="120" w:type="dxa"/>
+            </w:tcMar>
             <w:vAlign w:val="center"/>
           </w:tcPr>
           <w:p>
-            <w:pPr>
-              <w:spacing w:after="60"/>
-            </w:pPr>
             <w:r>
-              <w:rPr>
-                <w:rFonts w:ascii="Calibri" w:hAnsi="Calibri"/>
-                <w:sz w:val="20"/>
-              </w:rPr>
-              <w:t>ECC-class packs</w:t>
+              <w:t>Skills</w:t>
             </w:r>
           </w:p>
         </w:tc>
         <w:tc>
           <w:tcPr>
-            <w:tcW w:type="dxa" w:w="3168"/>
+            <w:tcW w:type="dxa" w:w="6192"/>
+            <w:tcMar>
+              <w:top w:w="80" w:type="dxa"/>
+              <w:start w:w="120" w:type="dxa"/>
+              <w:bottom w:w="80" w:type="dxa"/>
+              <w:end w:w="120" w:type="dxa"/>
+            </w:tcMar>
             <w:vAlign w:val="center"/>
           </w:tcPr>
           <w:p>
-            <w:pPr>
-              <w:spacing w:after="60"/>
-            </w:pPr>
             <w:r>
-              <w:rPr>
-                <w:rFonts w:ascii="Calibri" w:hAnsi="Calibri"/>
-                <w:sz w:val="20"/>
-              </w:rPr>
-              <w:t>Broad catalog and profiles</w:t>
-            </w:r>
-          </w:p>
-        </w:tc>
-        <w:tc>
-          <w:tcPr>
-            <w:tcW w:type="dxa" w:w="3960"/>
-            <w:vAlign w:val="center"/>
-          </w:tcPr>
-          <w:p>
-            <w:pPr>
-              <w:spacing w:after="60"/>
-            </w:pPr>
-            <w:r>
-              <w:rPr>
-                <w:rFonts w:ascii="Calibri" w:hAnsi="Calibri"/>
-                <w:sz w:val="20"/>
-              </w:rPr>
-              <w:t>Capability sidecars, validation gates, packaging, and receipts</w:t>
+              <w:t>366</w:t>
             </w:r>
           </w:p>
         </w:tc>
@@ -559,55 +413,35 @@
       <w:tr>
         <w:tc>
           <w:tcPr>
-            <w:tcW w:type="dxa" w:w="2232"/>
+            <w:tcW w:type="dxa" w:w="3168"/>
+            <w:tcMar>
+              <w:top w:w="80" w:type="dxa"/>
+              <w:start w:w="120" w:type="dxa"/>
+              <w:bottom w:w="80" w:type="dxa"/>
+              <w:end w:w="120" w:type="dxa"/>
+            </w:tcMar>
             <w:vAlign w:val="center"/>
           </w:tcPr>
           <w:p>
-            <w:pPr>
-              <w:spacing w:after="60"/>
-            </w:pPr>
             <w:r>
-              <w:rPr>
-                <w:rFonts w:ascii="Calibri" w:hAnsi="Calibri"/>
-                <w:sz w:val="20"/>
-              </w:rPr>
-              <w:t>Superpowers-style discipline</w:t>
+              <w:t>Packs</w:t>
             </w:r>
           </w:p>
         </w:tc>
         <w:tc>
           <w:tcPr>
-            <w:tcW w:type="dxa" w:w="3168"/>
+            <w:tcW w:type="dxa" w:w="6192"/>
+            <w:tcMar>
+              <w:top w:w="80" w:type="dxa"/>
+              <w:start w:w="120" w:type="dxa"/>
+              <w:bottom w:w="80" w:type="dxa"/>
+              <w:end w:w="120" w:type="dxa"/>
+            </w:tcMar>
             <w:vAlign w:val="center"/>
           </w:tcPr>
           <w:p>
-            <w:pPr>
-              <w:spacing w:after="60"/>
-            </w:pPr>
             <w:r>
-              <w:rPr>
-                <w:rFonts w:ascii="Calibri" w:hAnsi="Calibri"/>
-                <w:sz w:val="20"/>
-              </w:rPr>
-              <w:t>Plan, TDD, review, verification norms</w:t>
-            </w:r>
-          </w:p>
-        </w:tc>
-        <w:tc>
-          <w:tcPr>
-            <w:tcW w:type="dxa" w:w="3960"/>
-            <w:vAlign w:val="center"/>
-          </w:tcPr>
-          <w:p>
-            <w:pPr>
-              <w:spacing w:after="60"/>
-            </w:pPr>
-            <w:r>
-              <w:rPr>
-                <w:rFonts w:ascii="Calibri" w:hAnsi="Calibri"/>
-                <w:sz w:val="20"/>
-              </w:rPr>
-              <w:t>Those norms plus enforceable capability policy and shipping evidence</w:t>
+              <w:t>26</w:t>
             </w:r>
           </w:p>
         </w:tc>
@@ -615,55 +449,179 @@
       <w:tr>
         <w:tc>
           <w:tcPr>
-            <w:tcW w:type="dxa" w:w="2232"/>
+            <w:tcW w:type="dxa" w:w="3168"/>
+            <w:tcMar>
+              <w:top w:w="80" w:type="dxa"/>
+              <w:start w:w="120" w:type="dxa"/>
+              <w:bottom w:w="80" w:type="dxa"/>
+              <w:end w:w="120" w:type="dxa"/>
+            </w:tcMar>
             <w:vAlign w:val="center"/>
           </w:tcPr>
           <w:p>
-            <w:pPr>
-              <w:spacing w:after="60"/>
-            </w:pPr>
             <w:r>
-              <w:rPr>
-                <w:rFonts w:ascii="Calibri" w:hAnsi="Calibri"/>
-                <w:sz w:val="20"/>
-              </w:rPr>
-              <w:t>Role/workflow collections</w:t>
+              <w:t>Profiles</w:t>
             </w:r>
           </w:p>
         </w:tc>
         <w:tc>
           <w:tcPr>
-            <w:tcW w:type="dxa" w:w="3168"/>
+            <w:tcW w:type="dxa" w:w="6192"/>
+            <w:tcMar>
+              <w:top w:w="80" w:type="dxa"/>
+              <w:start w:w="120" w:type="dxa"/>
+              <w:bottom w:w="80" w:type="dxa"/>
+              <w:end w:w="120" w:type="dxa"/>
+            </w:tcMar>
             <w:vAlign w:val="center"/>
           </w:tcPr>
           <w:p>
-            <w:pPr>
-              <w:spacing w:after="60"/>
-            </w:pPr>
             <w:r>
-              <w:rPr>
-                <w:rFonts w:ascii="Calibri" w:hAnsi="Calibri"/>
-                <w:sz w:val="20"/>
-              </w:rPr>
-              <w:t>Role lenses and ship processes</w:t>
+              <w:t>10</w:t>
+            </w:r>
+          </w:p>
+        </w:tc>
+      </w:tr>
+      <w:tr>
+        <w:tc>
+          <w:tcPr>
+            <w:tcW w:type="dxa" w:w="3168"/>
+            <w:tcMar>
+              <w:top w:w="80" w:type="dxa"/>
+              <w:start w:w="120" w:type="dxa"/>
+              <w:bottom w:w="80" w:type="dxa"/>
+              <w:end w:w="120" w:type="dxa"/>
+            </w:tcMar>
+            <w:vAlign w:val="center"/>
+          </w:tcPr>
+          <w:p>
+            <w:r>
+              <w:t>Agents</w:t>
             </w:r>
           </w:p>
         </w:tc>
         <w:tc>
           <w:tcPr>
-            <w:tcW w:type="dxa" w:w="3960"/>
+            <w:tcW w:type="dxa" w:w="6192"/>
+            <w:tcMar>
+              <w:top w:w="80" w:type="dxa"/>
+              <w:start w:w="120" w:type="dxa"/>
+              <w:bottom w:w="80" w:type="dxa"/>
+              <w:end w:w="120" w:type="dxa"/>
+            </w:tcMar>
             <w:vAlign w:val="center"/>
           </w:tcPr>
           <w:p>
-            <w:pPr>
-              <w:spacing w:after="60"/>
-            </w:pPr>
             <w:r>
-              <w:rPr>
-                <w:rFonts w:ascii="Calibri" w:hAnsi="Calibri"/>
-                <w:sz w:val="20"/>
-              </w:rPr>
-              <w:t>Portable skill packages that carry explicit trust metadata</w:t>
+              <w:t>98</w:t>
+            </w:r>
+          </w:p>
+        </w:tc>
+      </w:tr>
+      <w:tr>
+        <w:tc>
+          <w:tcPr>
+            <w:tcW w:type="dxa" w:w="3168"/>
+            <w:tcMar>
+              <w:top w:w="80" w:type="dxa"/>
+              <w:start w:w="120" w:type="dxa"/>
+              <w:bottom w:w="80" w:type="dxa"/>
+              <w:end w:w="120" w:type="dxa"/>
+            </w:tcMar>
+            <w:vAlign w:val="center"/>
+          </w:tcPr>
+          <w:p>
+            <w:r>
+              <w:t>Commands</w:t>
+            </w:r>
+          </w:p>
+        </w:tc>
+        <w:tc>
+          <w:tcPr>
+            <w:tcW w:type="dxa" w:w="6192"/>
+            <w:tcMar>
+              <w:top w:w="80" w:type="dxa"/>
+              <w:start w:w="120" w:type="dxa"/>
+              <w:bottom w:w="80" w:type="dxa"/>
+              <w:end w:w="120" w:type="dxa"/>
+            </w:tcMar>
+            <w:vAlign w:val="center"/>
+          </w:tcPr>
+          <w:p>
+            <w:r>
+              <w:t>124</w:t>
+            </w:r>
+          </w:p>
+        </w:tc>
+      </w:tr>
+      <w:tr>
+        <w:tc>
+          <w:tcPr>
+            <w:tcW w:type="dxa" w:w="3168"/>
+            <w:tcMar>
+              <w:top w:w="80" w:type="dxa"/>
+              <w:start w:w="120" w:type="dxa"/>
+              <w:bottom w:w="80" w:type="dxa"/>
+              <w:end w:w="120" w:type="dxa"/>
+            </w:tcMar>
+            <w:vAlign w:val="center"/>
+          </w:tcPr>
+          <w:p>
+            <w:r>
+              <w:t>Workflows</w:t>
+            </w:r>
+          </w:p>
+        </w:tc>
+        <w:tc>
+          <w:tcPr>
+            <w:tcW w:type="dxa" w:w="6192"/>
+            <w:tcMar>
+              <w:top w:w="80" w:type="dxa"/>
+              <w:start w:w="120" w:type="dxa"/>
+              <w:bottom w:w="80" w:type="dxa"/>
+              <w:end w:w="120" w:type="dxa"/>
+            </w:tcMar>
+            <w:vAlign w:val="center"/>
+          </w:tcPr>
+          <w:p>
+            <w:r>
+              <w:t>100</w:t>
+            </w:r>
+          </w:p>
+        </w:tc>
+      </w:tr>
+      <w:tr>
+        <w:tc>
+          <w:tcPr>
+            <w:tcW w:type="dxa" w:w="3168"/>
+            <w:tcMar>
+              <w:top w:w="80" w:type="dxa"/>
+              <w:start w:w="120" w:type="dxa"/>
+              <w:bottom w:w="80" w:type="dxa"/>
+              <w:end w:w="120" w:type="dxa"/>
+            </w:tcMar>
+            <w:vAlign w:val="center"/>
+          </w:tcPr>
+          <w:p>
+            <w:r>
+              <w:t>Known host targets</w:t>
+            </w:r>
+          </w:p>
+        </w:tc>
+        <w:tc>
+          <w:tcPr>
+            <w:tcW w:type="dxa" w:w="6192"/>
+            <w:tcMar>
+              <w:top w:w="80" w:type="dxa"/>
+              <w:start w:w="120" w:type="dxa"/>
+              <w:bottom w:w="80" w:type="dxa"/>
+              <w:end w:w="120" w:type="dxa"/>
+            </w:tcMar>
+            <w:vAlign w:val="center"/>
+          </w:tcPr>
+          <w:p>
+            <w:r>
+              <w:t>7</w:t>
             </w:r>
           </w:p>
         </w:tc>
@@ -675,60 +633,17 @@
         <w:pStyle w:val="Heading1"/>
       </w:pPr>
       <w:r>
-        <w:t>4. Architecture</w:t>
+        <w:t>2. Problem And Product Decision</w:t>
       </w:r>
     </w:p>
     <w:p>
       <w:r>
-        <w:t>The system keeps one canonical skill shape: SKILL.md plus skillsforge.json. Source modules stay separated by capability: loader, router, policy, Codex package compiler, install, evidence, receipt, and quality gates.</w:t>
+        <w:t>Agent Skills are valuable because they package repeatable work. The risk is that a skill can also carry undeclared shell commands, network references, write paths, scripts, or opaque files. A large catalog can look impressive while still leaving operators unable to answer what a skill can do, whether it can be safely installed, and whether packaged bytes changed later.</w:t>
       </w:r>
     </w:p>
     <w:p>
-      <w:pPr>
-        <w:pStyle w:val="ListNumber"/>
-      </w:pPr>
       <w:r>
-        <w:t>Load only the metadata needed for catalog and routing until a command needs full skill bodies.</w:t>
-      </w:r>
-    </w:p>
-    <w:p>
-      <w:pPr>
-        <w:pStyle w:val="ListNumber"/>
-      </w:pPr>
-      <w:r>
-        <w:t>Validate structure with schema rules and sidecar policy requirements.</w:t>
-      </w:r>
-    </w:p>
-    <w:p>
-      <w:pPr>
-        <w:pStyle w:val="ListNumber"/>
-      </w:pPr>
-      <w:r>
-        <w:t>Scan text files and scripts for undeclared exec, network, and write behavior.</w:t>
-      </w:r>
-    </w:p>
-    <w:p>
-      <w:pPr>
-        <w:pStyle w:val="ListNumber"/>
-      </w:pPr>
-      <w:r>
-        <w:t>Package a safe skill into a Codex plugin tree with policy hooks and immutable sidecar copy.</w:t>
-      </w:r>
-    </w:p>
-    <w:p>
-      <w:pPr>
-        <w:pStyle w:val="ListNumber"/>
-      </w:pPr>
-      <w:r>
-        <w:t>Install validated packages into host skill directories with explicit fidelity labels.</w:t>
-      </w:r>
-    </w:p>
-    <w:p>
-      <w:pPr>
-        <w:pStyle w:val="ListNumber"/>
-      </w:pPr>
-      <w:r>
-        <w:t>Record package hashes and evidence receipts for later verification.</w:t>
+        <w:t>The product choice was to solve the trust gap rather than clone swarm orchestration or claim OS sandboxing. SkillsForge makes skill packages reviewable, least-privilege, packageable, routed, and tamper-evident. Runtime enforcement is claimed only when a host honors the generated hook or equivalent policy decision.</w:t>
       </w:r>
     </w:p>
     <w:p>
@@ -736,12 +651,7 @@
         <w:pStyle w:val="Heading1"/>
       </w:pPr>
       <w:r>
-        <w:t>5. Universal host strategy</w:t>
-      </w:r>
-    </w:p>
-    <w:p>
-      <w:r>
-        <w:t>The host strategy is deliberately honest. Codex gets the strongest native package path. Claude Code gets full install fidelity. Other AI CLIs get complete validated skill packages, but runtime policy enforcement is not claimed unless the host honors equivalent hooks.</w:t>
+        <w:t>3. Architecture Shipped</w:t>
       </w:r>
     </w:p>
     <w:tbl>
@@ -749,75 +659,52 @@
         <w:tblStyle w:val="TableGrid"/>
         <w:tblW w:type="auto" w:w="0"/>
         <w:jc w:val="left"/>
-        <w:tblLayout w:type="fixed"/>
         <w:tblLook w:firstColumn="1" w:firstRow="1" w:lastColumn="0" w:lastRow="0" w:noHBand="0" w:noVBand="1" w:val="04A0"/>
       </w:tblPr>
       <w:tblGrid>
-        <w:gridCol w:w="3120"/>
-        <w:gridCol w:w="3120"/>
-        <w:gridCol w:w="3120"/>
+        <w:gridCol w:w="4680"/>
+        <w:gridCol w:w="4680"/>
       </w:tblGrid>
       <w:tr>
         <w:tc>
           <w:tcPr>
-            <w:tcW w:type="dxa" w:w="2376"/>
+            <w:tcW w:type="dxa" w:w="2592"/>
+            <w:shd w:fill="E8EEF5"/>
+            <w:tcMar>
+              <w:top w:w="80" w:type="dxa"/>
+              <w:start w:w="120" w:type="dxa"/>
+              <w:bottom w:w="80" w:type="dxa"/>
+              <w:end w:w="120" w:type="dxa"/>
+            </w:tcMar>
             <w:vAlign w:val="center"/>
-            <w:shd w:fill="F2F4F7"/>
           </w:tcPr>
           <w:p>
-            <w:pPr>
-              <w:spacing w:after="60"/>
-            </w:pPr>
             <w:r>
               <w:rPr>
-                <w:rFonts w:ascii="Calibri" w:hAnsi="Calibri"/>
                 <w:b/>
-                <w:color w:val="0B2545"/>
-                <w:sz w:val="20"/>
               </w:rPr>
-              <w:t>Host mode</w:t>
+              <w:t>Layer</w:t>
             </w:r>
           </w:p>
         </w:tc>
         <w:tc>
           <w:tcPr>
-            <w:tcW w:type="dxa" w:w="3024"/>
+            <w:tcW w:type="dxa" w:w="6768"/>
+            <w:shd w:fill="E8EEF5"/>
+            <w:tcMar>
+              <w:top w:w="80" w:type="dxa"/>
+              <w:start w:w="120" w:type="dxa"/>
+              <w:bottom w:w="80" w:type="dxa"/>
+              <w:end w:w="120" w:type="dxa"/>
+            </w:tcMar>
             <w:vAlign w:val="center"/>
-            <w:shd w:fill="F2F4F7"/>
           </w:tcPr>
           <w:p>
-            <w:pPr>
-              <w:spacing w:after="60"/>
-            </w:pPr>
             <w:r>
               <w:rPr>
-                <w:rFonts w:ascii="Calibri" w:hAnsi="Calibri"/>
                 <w:b/>
-                <w:color w:val="0B2545"/>
-                <w:sz w:val="20"/>
               </w:rPr>
-              <w:t>CLI surface</w:t>
-            </w:r>
-          </w:p>
-        </w:tc>
-        <w:tc>
-          <w:tcPr>
-            <w:tcW w:type="dxa" w:w="3960"/>
-            <w:vAlign w:val="center"/>
-            <w:shd w:fill="F2F4F7"/>
-          </w:tcPr>
-          <w:p>
-            <w:pPr>
-              <w:spacing w:after="60"/>
-            </w:pPr>
-            <w:r>
-              <w:rPr>
-                <w:rFonts w:ascii="Calibri" w:hAnsi="Calibri"/>
-                <w:b/>
-                <w:color w:val="0B2545"/>
-                <w:sz w:val="20"/>
-              </w:rPr>
-              <w:t>Boundary</w:t>
+              <w:t>Implementation</w:t>
             </w:r>
           </w:p>
         </w:tc>
@@ -825,55 +712,35 @@
       <w:tr>
         <w:tc>
           <w:tcPr>
-            <w:tcW w:type="dxa" w:w="2376"/>
+            <w:tcW w:type="dxa" w:w="2592"/>
+            <w:tcMar>
+              <w:top w:w="80" w:type="dxa"/>
+              <w:start w:w="120" w:type="dxa"/>
+              <w:bottom w:w="80" w:type="dxa"/>
+              <w:end w:w="120" w:type="dxa"/>
+            </w:tcMar>
             <w:vAlign w:val="center"/>
           </w:tcPr>
           <w:p>
-            <w:pPr>
-              <w:spacing w:after="60"/>
-            </w:pPr>
             <w:r>
-              <w:rPr>
-                <w:rFonts w:ascii="Calibri" w:hAnsi="Calibri"/>
-                <w:sz w:val="20"/>
-              </w:rPr>
-              <w:t>Codex first</w:t>
+              <w:t>Trust spine</w:t>
             </w:r>
           </w:p>
         </w:tc>
         <w:tc>
           <w:tcPr>
-            <w:tcW w:type="dxa" w:w="3024"/>
+            <w:tcW w:type="dxa" w:w="6768"/>
+            <w:tcMar>
+              <w:top w:w="80" w:type="dxa"/>
+              <w:start w:w="120" w:type="dxa"/>
+              <w:bottom w:w="80" w:type="dxa"/>
+              <w:end w:w="120" w:type="dxa"/>
+            </w:tcMar>
             <w:vAlign w:val="center"/>
           </w:tcPr>
           <w:p>
-            <w:pPr>
-              <w:spacing w:after="60"/>
-            </w:pPr>
             <w:r>
-              <w:rPr>
-                <w:rFonts w:ascii="Calibri" w:hAnsi="Calibri"/>
-                <w:sz w:val="20"/>
-              </w:rPr>
-              <w:t>package --host codex</w:t>
-            </w:r>
-          </w:p>
-        </w:tc>
-        <w:tc>
-          <w:tcPr>
-            <w:tcW w:type="dxa" w:w="3960"/>
-            <w:vAlign w:val="center"/>
-          </w:tcPr>
-          <w:p>
-            <w:pPr>
-              <w:spacing w:after="60"/>
-            </w:pPr>
-            <w:r>
-              <w:rPr>
-                <w:rFonts w:ascii="Calibri" w:hAnsi="Calibri"/>
-                <w:sz w:val="20"/>
-              </w:rPr>
-              <w:t>Guarded native plugin for one selected skill, subject to Codex hook trust and matcher scope</w:t>
+              <w:t>validate, skillshield, package --host codex, receipt, verify-receipt, evidence</w:t>
             </w:r>
           </w:p>
         </w:tc>
@@ -881,55 +748,35 @@
       <w:tr>
         <w:tc>
           <w:tcPr>
-            <w:tcW w:type="dxa" w:w="2376"/>
+            <w:tcW w:type="dxa" w:w="2592"/>
+            <w:tcMar>
+              <w:top w:w="80" w:type="dxa"/>
+              <w:start w:w="120" w:type="dxa"/>
+              <w:bottom w:w="80" w:type="dxa"/>
+              <w:end w:w="120" w:type="dxa"/>
+            </w:tcMar>
             <w:vAlign w:val="center"/>
           </w:tcPr>
           <w:p>
-            <w:pPr>
-              <w:spacing w:after="60"/>
-            </w:pPr>
             <w:r>
-              <w:rPr>
-                <w:rFonts w:ascii="Calibri" w:hAnsi="Calibri"/>
-                <w:sz w:val="20"/>
-              </w:rPr>
-              <w:t>Claude Code second</w:t>
+              <w:t>Universal hosts</w:t>
             </w:r>
           </w:p>
         </w:tc>
         <w:tc>
           <w:tcPr>
-            <w:tcW w:type="dxa" w:w="3024"/>
+            <w:tcW w:type="dxa" w:w="6768"/>
+            <w:tcMar>
+              <w:top w:w="80" w:type="dxa"/>
+              <w:start w:w="120" w:type="dxa"/>
+              <w:bottom w:w="80" w:type="dxa"/>
+              <w:end w:w="120" w:type="dxa"/>
+            </w:tcMar>
             <w:vAlign w:val="center"/>
           </w:tcPr>
           <w:p>
-            <w:pPr>
-              <w:spacing w:after="60"/>
-            </w:pPr>
             <w:r>
-              <w:rPr>
-                <w:rFonts w:ascii="Calibri" w:hAnsi="Calibri"/>
-                <w:sz w:val="20"/>
-              </w:rPr>
-              <w:t>install --hosts claude-code</w:t>
-            </w:r>
-          </w:p>
-        </w:tc>
-        <w:tc>
-          <w:tcPr>
-            <w:tcW w:type="dxa" w:w="3960"/>
-            <w:vAlign w:val="center"/>
-          </w:tcPr>
-          <w:p>
-            <w:pPr>
-              <w:spacing w:after="60"/>
-            </w:pPr>
-            <w:r>
-              <w:rPr>
-                <w:rFonts w:ascii="Calibri" w:hAnsi="Calibri"/>
-                <w:sz w:val="20"/>
-              </w:rPr>
-              <w:t>Full skill package with Claude hooks and SkillsForge sidecar</w:t>
+              <w:t>Codex, Claude Code, Cursor, OpenCode, ZCode, Hermes, Gemini, plus custom host paths under home</w:t>
             </w:r>
           </w:p>
         </w:tc>
@@ -937,55 +784,35 @@
       <w:tr>
         <w:tc>
           <w:tcPr>
-            <w:tcW w:type="dxa" w:w="2376"/>
+            <w:tcW w:type="dxa" w:w="2592"/>
+            <w:tcMar>
+              <w:top w:w="80" w:type="dxa"/>
+              <w:start w:w="120" w:type="dxa"/>
+              <w:bottom w:w="80" w:type="dxa"/>
+              <w:end w:w="120" w:type="dxa"/>
+            </w:tcMar>
             <w:vAlign w:val="center"/>
           </w:tcPr>
           <w:p>
-            <w:pPr>
-              <w:spacing w:after="60"/>
-            </w:pPr>
             <w:r>
-              <w:rPr>
-                <w:rFonts w:ascii="Calibri" w:hAnsi="Calibri"/>
-                <w:sz w:val="20"/>
-              </w:rPr>
-              <w:t>Package fidelity</w:t>
+              <w:t>Workbench CLI</w:t>
             </w:r>
           </w:p>
         </w:tc>
         <w:tc>
           <w:tcPr>
-            <w:tcW w:type="dxa" w:w="3024"/>
+            <w:tcW w:type="dxa" w:w="6768"/>
+            <w:tcMar>
+              <w:top w:w="80" w:type="dxa"/>
+              <w:start w:w="120" w:type="dxa"/>
+              <w:bottom w:w="80" w:type="dxa"/>
+              <w:end w:w="120" w:type="dxa"/>
+            </w:tcMar>
             <w:vAlign w:val="center"/>
           </w:tcPr>
           <w:p>
-            <w:pPr>
-              <w:spacing w:after="60"/>
-            </w:pPr>
             <w:r>
-              <w:rPr>
-                <w:rFonts w:ascii="Calibri" w:hAnsi="Calibri"/>
-                <w:sz w:val="20"/>
-              </w:rPr>
-              <w:t>install --hosts cursor,opencode,zcode,hermes,gemini</w:t>
-            </w:r>
-          </w:p>
-        </w:tc>
-        <w:tc>
-          <w:tcPr>
-            <w:tcW w:type="dxa" w:w="3960"/>
-            <w:vAlign w:val="center"/>
-          </w:tcPr>
-          <w:p>
-            <w:pPr>
-              <w:spacing w:after="60"/>
-            </w:pPr>
-            <w:r>
-              <w:rPr>
-                <w:rFonts w:ascii="Calibri" w:hAnsi="Calibri"/>
-                <w:sz w:val="20"/>
-              </w:rPr>
-              <w:t>Validated packages copied; runtime policy parity is not claimed</w:t>
+              <w:t>wb status/tree/find/grep/diff/errors/bigfiles/recent/proof with --json, --limit, and --full</w:t>
             </w:r>
           </w:p>
         </w:tc>
@@ -993,55 +820,215 @@
       <w:tr>
         <w:tc>
           <w:tcPr>
-            <w:tcW w:type="dxa" w:w="2376"/>
+            <w:tcW w:type="dxa" w:w="2592"/>
+            <w:tcMar>
+              <w:top w:w="80" w:type="dxa"/>
+              <w:start w:w="120" w:type="dxa"/>
+              <w:bottom w:w="80" w:type="dxa"/>
+              <w:end w:w="120" w:type="dxa"/>
+            </w:tcMar>
             <w:vAlign w:val="center"/>
           </w:tcPr>
           <w:p>
-            <w:pPr>
-              <w:spacing w:after="60"/>
-            </w:pPr>
             <w:r>
-              <w:rPr>
-                <w:rFonts w:ascii="Calibri" w:hAnsi="Calibri"/>
-                <w:sz w:val="20"/>
-              </w:rPr>
-              <w:t>Custom AI CLI</w:t>
+              <w:t>PowerShell helpers</w:t>
             </w:r>
           </w:p>
         </w:tc>
         <w:tc>
           <w:tcPr>
-            <w:tcW w:type="dxa" w:w="3024"/>
+            <w:tcW w:type="dxa" w:w="6768"/>
+            <w:tcMar>
+              <w:top w:w="80" w:type="dxa"/>
+              <w:start w:w="120" w:type="dxa"/>
+              <w:bottom w:w="80" w:type="dxa"/>
+              <w:end w:w="120" w:type="dxa"/>
+            </w:tcMar>
             <w:vAlign w:val="center"/>
           </w:tcPr>
           <w:p>
-            <w:pPr>
-              <w:spacing w:after="60"/>
-            </w:pPr>
             <w:r>
-              <w:rPr>
-                <w:rFonts w:ascii="Calibri" w:hAnsi="Calibri"/>
-                <w:sz w:val="20"/>
-              </w:rPr>
-              <w:t>install --custom-host my-agent:.my-agent/skills</w:t>
+              <w:t>ps export writes sf-status, sf-tree, sf-find, sf-grep, sf-diff, sf-errors, sf-bigfiles, sf-recent, sf-ports, sf-proof</w:t>
+            </w:r>
+          </w:p>
+        </w:tc>
+      </w:tr>
+      <w:tr>
+        <w:tc>
+          <w:tcPr>
+            <w:tcW w:type="dxa" w:w="2592"/>
+            <w:tcMar>
+              <w:top w:w="80" w:type="dxa"/>
+              <w:start w:w="120" w:type="dxa"/>
+              <w:bottom w:w="80" w:type="dxa"/>
+              <w:end w:w="120" w:type="dxa"/>
+            </w:tcMar>
+            <w:vAlign w:val="center"/>
+          </w:tcPr>
+          <w:p>
+            <w:r>
+              <w:t>Local library</w:t>
             </w:r>
           </w:p>
         </w:tc>
         <w:tc>
           <w:tcPr>
-            <w:tcW w:type="dxa" w:w="3960"/>
+            <w:tcW w:type="dxa" w:w="6768"/>
+            <w:tcMar>
+              <w:top w:w="80" w:type="dxa"/>
+              <w:start w:w="120" w:type="dxa"/>
+              <w:bottom w:w="80" w:type="dxa"/>
+              <w:end w:w="120" w:type="dxa"/>
+            </w:tcMar>
             <w:vAlign w:val="center"/>
           </w:tcPr>
           <w:p>
-            <w:pPr>
-              <w:spacing w:after="60"/>
-            </w:pPr>
             <w:r>
-              <w:rPr>
-                <w:rFonts w:ascii="Calibri" w:hAnsi="Calibri"/>
-                <w:sz w:val="20"/>
-              </w:rPr>
-              <w:t>Kebab-case id, path must stay under home, package-fidelity only</w:t>
+              <w:t>lib build emits JSON, skillsforge-library.html, and skillsforge-ai-index.html</w:t>
+            </w:r>
+          </w:p>
+        </w:tc>
+      </w:tr>
+      <w:tr>
+        <w:tc>
+          <w:tcPr>
+            <w:tcW w:type="dxa" w:w="2592"/>
+            <w:tcMar>
+              <w:top w:w="80" w:type="dxa"/>
+              <w:start w:w="120" w:type="dxa"/>
+              <w:bottom w:w="80" w:type="dxa"/>
+              <w:end w:w="120" w:type="dxa"/>
+            </w:tcMar>
+            <w:vAlign w:val="center"/>
+          </w:tcPr>
+          <w:p>
+            <w:r>
+              <w:t>Local UI</w:t>
+            </w:r>
+          </w:p>
+        </w:tc>
+        <w:tc>
+          <w:tcPr>
+            <w:tcW w:type="dxa" w:w="6768"/>
+            <w:tcMar>
+              <w:top w:w="80" w:type="dxa"/>
+              <w:start w:w="120" w:type="dxa"/>
+              <w:bottom w:w="80" w:type="dxa"/>
+              <w:end w:w="120" w:type="dxa"/>
+            </w:tcMar>
+            <w:vAlign w:val="center"/>
+          </w:tcPr>
+          <w:p>
+            <w:r>
+              <w:t>lib serve binds to 127.0.0.1; read-only by default; removal requires explicit mutation flags and confirmation</w:t>
+            </w:r>
+          </w:p>
+        </w:tc>
+      </w:tr>
+      <w:tr>
+        <w:tc>
+          <w:tcPr>
+            <w:tcW w:type="dxa" w:w="2592"/>
+            <w:tcMar>
+              <w:top w:w="80" w:type="dxa"/>
+              <w:start w:w="120" w:type="dxa"/>
+              <w:bottom w:w="80" w:type="dxa"/>
+              <w:end w:w="120" w:type="dxa"/>
+            </w:tcMar>
+            <w:vAlign w:val="center"/>
+          </w:tcPr>
+          <w:p>
+            <w:r>
+              <w:t>Workflow catalog</w:t>
+            </w:r>
+          </w:p>
+        </w:tc>
+        <w:tc>
+          <w:tcPr>
+            <w:tcW w:type="dxa" w:w="6768"/>
+            <w:tcMar>
+              <w:top w:w="80" w:type="dxa"/>
+              <w:start w:w="120" w:type="dxa"/>
+              <w:bottom w:w="80" w:type="dxa"/>
+              <w:end w:w="120" w:type="dxa"/>
+            </w:tcMar>
+            <w:vAlign w:val="center"/>
+          </w:tcPr>
+          <w:p>
+            <w:r>
+              <w:t>100 JSON workflows with category, goal, inputs, steps, skills, agents, commands, stop gates, token budget, quality gate, and risk</w:t>
+            </w:r>
+          </w:p>
+        </w:tc>
+      </w:tr>
+      <w:tr>
+        <w:tc>
+          <w:tcPr>
+            <w:tcW w:type="dxa" w:w="2592"/>
+            <w:tcMar>
+              <w:top w:w="80" w:type="dxa"/>
+              <w:start w:w="120" w:type="dxa"/>
+              <w:bottom w:w="80" w:type="dxa"/>
+              <w:end w:w="120" w:type="dxa"/>
+            </w:tcMar>
+            <w:vAlign w:val="center"/>
+          </w:tcPr>
+          <w:p>
+            <w:r>
+              <w:t>Auto router</w:t>
+            </w:r>
+          </w:p>
+        </w:tc>
+        <w:tc>
+          <w:tcPr>
+            <w:tcW w:type="dxa" w:w="6768"/>
+            <w:tcMar>
+              <w:top w:w="80" w:type="dxa"/>
+              <w:start w:w="120" w:type="dxa"/>
+              <w:bottom w:w="80" w:type="dxa"/>
+              <w:end w:w="120" w:type="dxa"/>
+            </w:tcMar>
+            <w:vAlign w:val="center"/>
+          </w:tcPr>
+          <w:p>
+            <w:r>
+              <w:t>auto plan and auto run --read-only combine skill routing and workflow dry-run recommendation</w:t>
+            </w:r>
+          </w:p>
+        </w:tc>
+      </w:tr>
+      <w:tr>
+        <w:tc>
+          <w:tcPr>
+            <w:tcW w:type="dxa" w:w="2592"/>
+            <w:tcMar>
+              <w:top w:w="80" w:type="dxa"/>
+              <w:start w:w="120" w:type="dxa"/>
+              <w:bottom w:w="80" w:type="dxa"/>
+              <w:end w:w="120" w:type="dxa"/>
+            </w:tcMar>
+            <w:vAlign w:val="center"/>
+          </w:tcPr>
+          <w:p>
+            <w:r>
+              <w:t>MCP</w:t>
+            </w:r>
+          </w:p>
+        </w:tc>
+        <w:tc>
+          <w:tcPr>
+            <w:tcW w:type="dxa" w:w="6768"/>
+            <w:tcMar>
+              <w:top w:w="80" w:type="dxa"/>
+              <w:start w:w="120" w:type="dxa"/>
+              <w:bottom w:w="80" w:type="dxa"/>
+              <w:end w:w="120" w:type="dxa"/>
+            </w:tcMar>
+            <w:vAlign w:val="center"/>
+          </w:tcPr>
+          <w:p>
+            <w:r>
+              <w:t>validate, route, skillshield, library_index, recommend_skill, recommend_workflow, workflow_show; no default write tools</w:t>
             </w:r>
           </w:p>
         </w:tc>
@@ -1053,79 +1040,12 @@
         <w:pStyle w:val="Heading1"/>
       </w:pPr>
       <w:r>
-        <w:t>6. Work shipped in this hardening pass</w:t>
+        <w:t>4. Workflow Catalog</w:t>
       </w:r>
     </w:p>
     <w:p>
-      <w:pPr>
-        <w:pStyle w:val="ListBullet"/>
-      </w:pPr>
       <w:r>
-        <w:t>Added universal host registry metadata, install hints, ZCode-compatible target, Hermes target, and buildCustomHost().</w:t>
-      </w:r>
-    </w:p>
-    <w:p>
-      <w:pPr>
-        <w:pStyle w:val="ListBullet"/>
-      </w:pPr>
-      <w:r>
-        <w:t>Added skillsforge hosts with JSON and human output for host discovery and trust boundaries.</w:t>
-      </w:r>
-    </w:p>
-    <w:p>
-      <w:pPr>
-        <w:pStyle w:val="ListBullet"/>
-      </w:pPr>
-      <w:r>
-        <w:t>Added install --hosts all, install --hosts detected, and install --custom-host id:.agent/skills.</w:t>
-      </w:r>
-    </w:p>
-    <w:p>
-      <w:pPr>
-        <w:pStyle w:val="ListBullet"/>
-      </w:pPr>
-      <w:r>
-        <w:t>Expanded tests for host metadata, safe custom path handling, install dry-runs, and bundled CLI behavior.</w:t>
-      </w:r>
-    </w:p>
-    <w:p>
-      <w:pPr>
-        <w:pStyle w:val="ListBullet"/>
-      </w:pPr>
-      <w:r>
-        <w:t>Rebuilt the bundled CLI under plugins/skillsforge/bin/skillsforge.mjs.</w:t>
-      </w:r>
-    </w:p>
-    <w:p>
-      <w:pPr>
-        <w:pStyle w:val="ListBullet"/>
-      </w:pPr>
-      <w:r>
-        <w:t>Updated README with inline MP4, universal host fanout graphic, host matrix, and executable install examples.</w:t>
-      </w:r>
-    </w:p>
-    <w:p>
-      <w:pPr>
-        <w:pStyle w:val="ListBullet"/>
-      </w:pPr>
-      <w:r>
-        <w:t>Added docs/universal-hosts.md and synchronized architecture, demo script, and threat model.</w:t>
-      </w:r>
-    </w:p>
-    <w:p>
-      <w:pPr>
-        <w:pStyle w:val="ListBullet"/>
-      </w:pPr>
-      <w:r>
-        <w:t>Kept stale Remotion source explanations out of public README/docs while preserving legitimate media skill names in the catalog.</w:t>
-      </w:r>
-    </w:p>
-    <w:p>
-      <w:pPr>
-        <w:pStyle w:val="Heading1"/>
-      </w:pPr>
-      <w:r>
-        <w:t>7. Verification evidence</w:t>
+        <w:t>The workflow catalog is intentionally structured rather than a loose dump. Every workflow is dry-run first and points to shipped skills and shipped agent role files. Tests enforce the exact count and category distribution.</w:t>
       </w:r>
     </w:p>
     <w:tbl>
@@ -1133,7 +1053,6 @@
         <w:tblStyle w:val="TableGrid"/>
         <w:tblW w:type="auto" w:w="0"/>
         <w:jc w:val="left"/>
-        <w:tblLayout w:type="fixed"/>
         <w:tblLook w:firstColumn="1" w:firstRow="1" w:lastColumn="0" w:lastRow="0" w:noHBand="0" w:noVBand="1" w:val="04A0"/>
       </w:tblPr>
       <w:tblGrid>
@@ -1143,43 +1062,43 @@
       <w:tr>
         <w:tc>
           <w:tcPr>
-            <w:tcW w:type="dxa" w:w="2880"/>
+            <w:tcW w:type="dxa" w:w="4320"/>
+            <w:shd w:fill="E8EEF5"/>
+            <w:tcMar>
+              <w:top w:w="80" w:type="dxa"/>
+              <w:start w:w="120" w:type="dxa"/>
+              <w:bottom w:w="80" w:type="dxa"/>
+              <w:end w:w="120" w:type="dxa"/>
+            </w:tcMar>
             <w:vAlign w:val="center"/>
-            <w:shd w:fill="F2F4F7"/>
           </w:tcPr>
           <w:p>
-            <w:pPr>
-              <w:spacing w:after="60"/>
-            </w:pPr>
             <w:r>
               <w:rPr>
-                <w:rFonts w:ascii="Calibri" w:hAnsi="Calibri"/>
                 <w:b/>
-                <w:color w:val="0B2545"/>
-                <w:sz w:val="20"/>
               </w:rPr>
-              <w:t>Gate</w:t>
+              <w:t>Category</w:t>
             </w:r>
           </w:p>
         </w:tc>
         <w:tc>
           <w:tcPr>
-            <w:tcW w:type="dxa" w:w="6480"/>
+            <w:tcW w:type="dxa" w:w="1728"/>
+            <w:shd w:fill="E8EEF5"/>
+            <w:tcMar>
+              <w:top w:w="80" w:type="dxa"/>
+              <w:start w:w="120" w:type="dxa"/>
+              <w:bottom w:w="80" w:type="dxa"/>
+              <w:end w:w="120" w:type="dxa"/>
+            </w:tcMar>
             <w:vAlign w:val="center"/>
-            <w:shd w:fill="F2F4F7"/>
           </w:tcPr>
           <w:p>
-            <w:pPr>
-              <w:spacing w:after="60"/>
-            </w:pPr>
             <w:r>
               <w:rPr>
-                <w:rFonts w:ascii="Calibri" w:hAnsi="Calibri"/>
                 <w:b/>
-                <w:color w:val="0B2545"/>
-                <w:sz w:val="20"/>
               </w:rPr>
-              <w:t>Result recorded</w:t>
+              <w:t>Count</w:t>
             </w:r>
           </w:p>
         </w:tc>
@@ -1187,37 +1106,35 @@
       <w:tr>
         <w:tc>
           <w:tcPr>
-            <w:tcW w:type="dxa" w:w="2880"/>
+            <w:tcW w:type="dxa" w:w="4320"/>
+            <w:tcMar>
+              <w:top w:w="80" w:type="dxa"/>
+              <w:start w:w="120" w:type="dxa"/>
+              <w:bottom w:w="80" w:type="dxa"/>
+              <w:end w:w="120" w:type="dxa"/>
+            </w:tcMar>
             <w:vAlign w:val="center"/>
           </w:tcPr>
           <w:p>
-            <w:pPr>
-              <w:spacing w:after="60"/>
-            </w:pPr>
             <w:r>
-              <w:rPr>
-                <w:rFonts w:ascii="Calibri" w:hAnsi="Calibri"/>
-                <w:sz w:val="20"/>
-              </w:rPr>
-              <w:t>Targeted host/install/CLI/OS tests</w:t>
+              <w:t>agentic</w:t>
             </w:r>
           </w:p>
         </w:tc>
         <w:tc>
           <w:tcPr>
-            <w:tcW w:type="dxa" w:w="6480"/>
+            <w:tcW w:type="dxa" w:w="1728"/>
+            <w:tcMar>
+              <w:top w:w="80" w:type="dxa"/>
+              <w:start w:w="120" w:type="dxa"/>
+              <w:bottom w:w="80" w:type="dxa"/>
+              <w:end w:w="120" w:type="dxa"/>
+            </w:tcMar>
             <w:vAlign w:val="center"/>
           </w:tcPr>
           <w:p>
-            <w:pPr>
-              <w:spacing w:after="60"/>
-            </w:pPr>
             <w:r>
-              <w:rPr>
-                <w:rFonts w:ascii="Calibri" w:hAnsi="Calibri"/>
-                <w:sz w:val="20"/>
-              </w:rPr>
-              <w:t>35 tests passed before full check</w:t>
+              <w:t>6</w:t>
             </w:r>
           </w:p>
         </w:tc>
@@ -1225,37 +1142,35 @@
       <w:tr>
         <w:tc>
           <w:tcPr>
-            <w:tcW w:type="dxa" w:w="2880"/>
+            <w:tcW w:type="dxa" w:w="4320"/>
+            <w:tcMar>
+              <w:top w:w="80" w:type="dxa"/>
+              <w:start w:w="120" w:type="dxa"/>
+              <w:bottom w:w="80" w:type="dxa"/>
+              <w:end w:w="120" w:type="dxa"/>
+            </w:tcMar>
             <w:vAlign w:val="center"/>
           </w:tcPr>
           <w:p>
-            <w:pPr>
-              <w:spacing w:after="60"/>
-            </w:pPr>
             <w:r>
-              <w:rPr>
-                <w:rFonts w:ascii="Calibri" w:hAnsi="Calibri"/>
-                <w:sz w:val="20"/>
-              </w:rPr>
-              <w:t>Full npm run check</w:t>
+              <w:t>coding</w:t>
             </w:r>
           </w:p>
         </w:tc>
         <w:tc>
           <w:tcPr>
-            <w:tcW w:type="dxa" w:w="6480"/>
+            <w:tcW w:type="dxa" w:w="1728"/>
+            <w:tcMar>
+              <w:top w:w="80" w:type="dxa"/>
+              <w:start w:w="120" w:type="dxa"/>
+              <w:bottom w:w="80" w:type="dxa"/>
+              <w:end w:w="120" w:type="dxa"/>
+            </w:tcMar>
             <w:vAlign w:val="center"/>
           </w:tcPr>
           <w:p>
-            <w:pPr>
-              <w:spacing w:after="60"/>
-            </w:pPr>
             <w:r>
-              <w:rPr>
-                <w:rFonts w:ascii="Calibri" w:hAnsi="Calibri"/>
-                <w:sz w:val="20"/>
-              </w:rPr>
-              <w:t>Pass on 2026-07-18</w:t>
+              <w:t>16</w:t>
             </w:r>
           </w:p>
         </w:tc>
@@ -1263,37 +1178,35 @@
       <w:tr>
         <w:tc>
           <w:tcPr>
-            <w:tcW w:type="dxa" w:w="2880"/>
+            <w:tcW w:type="dxa" w:w="4320"/>
+            <w:tcMar>
+              <w:top w:w="80" w:type="dxa"/>
+              <w:start w:w="120" w:type="dxa"/>
+              <w:bottom w:w="80" w:type="dxa"/>
+              <w:end w:w="120" w:type="dxa"/>
+            </w:tcMar>
             <w:vAlign w:val="center"/>
           </w:tcPr>
           <w:p>
-            <w:pPr>
-              <w:spacing w:after="60"/>
-            </w:pPr>
             <w:r>
-              <w:rPr>
-                <w:rFonts w:ascii="Calibri" w:hAnsi="Calibri"/>
-                <w:sz w:val="20"/>
-              </w:rPr>
-              <w:t>Repository validation</w:t>
+              <w:t>data</w:t>
             </w:r>
           </w:p>
         </w:tc>
         <w:tc>
           <w:tcPr>
-            <w:tcW w:type="dxa" w:w="6480"/>
+            <w:tcW w:type="dxa" w:w="1728"/>
+            <w:tcMar>
+              <w:top w:w="80" w:type="dxa"/>
+              <w:start w:w="120" w:type="dxa"/>
+              <w:bottom w:w="80" w:type="dxa"/>
+              <w:end w:w="120" w:type="dxa"/>
+            </w:tcMar>
             <w:vAlign w:val="center"/>
           </w:tcPr>
           <w:p>
-            <w:pPr>
-              <w:spacing w:after="60"/>
-            </w:pPr>
             <w:r>
-              <w:rPr>
-                <w:rFonts w:ascii="Calibri" w:hAnsi="Calibri"/>
-                <w:sz w:val="20"/>
-              </w:rPr>
-              <w:t>Marketplace manifest, plugin manifest, version lockstep, Codex marketplace present</w:t>
+              <w:t>8</w:t>
             </w:r>
           </w:p>
         </w:tc>
@@ -1301,37 +1214,35 @@
       <w:tr>
         <w:tc>
           <w:tcPr>
-            <w:tcW w:type="dxa" w:w="2880"/>
+            <w:tcW w:type="dxa" w:w="4320"/>
+            <w:tcMar>
+              <w:top w:w="80" w:type="dxa"/>
+              <w:start w:w="120" w:type="dxa"/>
+              <w:bottom w:w="80" w:type="dxa"/>
+              <w:end w:w="120" w:type="dxa"/>
+            </w:tcMar>
             <w:vAlign w:val="center"/>
           </w:tcPr>
           <w:p>
-            <w:pPr>
-              <w:spacing w:after="60"/>
-            </w:pPr>
             <w:r>
-              <w:rPr>
-                <w:rFonts w:ascii="Calibri" w:hAnsi="Calibri"/>
-                <w:sz w:val="20"/>
-              </w:rPr>
-              <w:t>Full skill validation</w:t>
+              <w:t>design</w:t>
             </w:r>
           </w:p>
         </w:tc>
         <w:tc>
           <w:tcPr>
-            <w:tcW w:type="dxa" w:w="6480"/>
+            <w:tcW w:type="dxa" w:w="1728"/>
+            <w:tcMar>
+              <w:top w:w="80" w:type="dxa"/>
+              <w:start w:w="120" w:type="dxa"/>
+              <w:bottom w:w="80" w:type="dxa"/>
+              <w:end w:w="120" w:type="dxa"/>
+            </w:tcMar>
             <w:vAlign w:val="center"/>
           </w:tcPr>
           <w:p>
-            <w:pPr>
-              <w:spacing w:after="60"/>
-            </w:pPr>
             <w:r>
-              <w:rPr>
-                <w:rFonts w:ascii="Calibri" w:hAnsi="Calibri"/>
-                <w:sz w:val="20"/>
-              </w:rPr>
-              <w:t>All 366 production skills passed under claude-code profile</w:t>
+              <w:t>10</w:t>
             </w:r>
           </w:p>
         </w:tc>
@@ -1339,37 +1250,35 @@
       <w:tr>
         <w:tc>
           <w:tcPr>
-            <w:tcW w:type="dxa" w:w="2880"/>
+            <w:tcW w:type="dxa" w:w="4320"/>
+            <w:tcMar>
+              <w:top w:w="80" w:type="dxa"/>
+              <w:start w:w="120" w:type="dxa"/>
+              <w:bottom w:w="80" w:type="dxa"/>
+              <w:end w:w="120" w:type="dxa"/>
+            </w:tcMar>
             <w:vAlign w:val="center"/>
           </w:tcPr>
           <w:p>
-            <w:pPr>
-              <w:spacing w:after="60"/>
-            </w:pPr>
             <w:r>
-              <w:rPr>
-                <w:rFonts w:ascii="Calibri" w:hAnsi="Calibri"/>
-                <w:sz w:val="20"/>
-              </w:rPr>
-              <w:t>Full test suite</w:t>
+              <w:t>docs</w:t>
             </w:r>
           </w:p>
         </w:tc>
         <w:tc>
           <w:tcPr>
-            <w:tcW w:type="dxa" w:w="6480"/>
+            <w:tcW w:type="dxa" w:w="1728"/>
+            <w:tcMar>
+              <w:top w:w="80" w:type="dxa"/>
+              <w:start w:w="120" w:type="dxa"/>
+              <w:bottom w:w="80" w:type="dxa"/>
+              <w:end w:w="120" w:type="dxa"/>
+            </w:tcMar>
             <w:vAlign w:val="center"/>
           </w:tcPr>
           <w:p>
-            <w:pPr>
-              <w:spacing w:after="60"/>
-            </w:pPr>
             <w:r>
-              <w:rPr>
-                <w:rFonts w:ascii="Calibri" w:hAnsi="Calibri"/>
-                <w:sz w:val="20"/>
-              </w:rPr>
-              <w:t>215 tests passed</w:t>
+              <w:t>10</w:t>
             </w:r>
           </w:p>
         </w:tc>
@@ -1377,37 +1286,35 @@
       <w:tr>
         <w:tc>
           <w:tcPr>
-            <w:tcW w:type="dxa" w:w="2880"/>
+            <w:tcW w:type="dxa" w:w="4320"/>
+            <w:tcMar>
+              <w:top w:w="80" w:type="dxa"/>
+              <w:start w:w="120" w:type="dxa"/>
+              <w:bottom w:w="80" w:type="dxa"/>
+              <w:end w:w="120" w:type="dxa"/>
+            </w:tcMar>
             <w:vAlign w:val="center"/>
           </w:tcPr>
           <w:p>
-            <w:pPr>
-              <w:spacing w:after="60"/>
-            </w:pPr>
             <w:r>
-              <w:rPr>
-                <w:rFonts w:ascii="Calibri" w:hAnsi="Calibri"/>
-                <w:sz w:val="20"/>
-              </w:rPr>
-              <w:t>Routing eval</w:t>
+              <w:t>media</w:t>
             </w:r>
           </w:p>
         </w:tc>
         <w:tc>
           <w:tcPr>
-            <w:tcW w:type="dxa" w:w="6480"/>
+            <w:tcW w:type="dxa" w:w="1728"/>
+            <w:tcMar>
+              <w:top w:w="80" w:type="dxa"/>
+              <w:start w:w="120" w:type="dxa"/>
+              <w:bottom w:w="80" w:type="dxa"/>
+              <w:end w:w="120" w:type="dxa"/>
+            </w:tcMar>
             <w:vAlign w:val="center"/>
           </w:tcPr>
           <w:p>
-            <w:pPr>
-              <w:spacing w:after="60"/>
-            </w:pPr>
             <w:r>
-              <w:rPr>
-                <w:rFonts w:ascii="Calibri" w:hAnsi="Calibri"/>
-                <w:sz w:val="20"/>
-              </w:rPr>
-              <w:t>Precision 1.00, recall 1.00, corpusSha256 42256dfd0f19c1b86c6170aa70e2b7f8f8ea8e7615315039dacf27a0ef72257a</w:t>
+              <w:t>6</w:t>
             </w:r>
           </w:p>
         </w:tc>
@@ -1415,37 +1322,35 @@
       <w:tr>
         <w:tc>
           <w:tcPr>
-            <w:tcW w:type="dxa" w:w="2880"/>
+            <w:tcW w:type="dxa" w:w="4320"/>
+            <w:tcMar>
+              <w:top w:w="80" w:type="dxa"/>
+              <w:start w:w="120" w:type="dxa"/>
+              <w:bottom w:w="80" w:type="dxa"/>
+              <w:end w:w="120" w:type="dxa"/>
+            </w:tcMar>
             <w:vAlign w:val="center"/>
           </w:tcPr>
           <w:p>
-            <w:pPr>
-              <w:spacing w:after="60"/>
-            </w:pPr>
             <w:r>
-              <w:rPr>
-                <w:rFonts w:ascii="Calibri" w:hAnsi="Calibri"/>
-                <w:sz w:val="20"/>
-              </w:rPr>
-              <w:t>Demo</w:t>
+              <w:t>ops</w:t>
             </w:r>
           </w:p>
         </w:tc>
         <w:tc>
           <w:tcPr>
-            <w:tcW w:type="dxa" w:w="6480"/>
+            <w:tcW w:type="dxa" w:w="1728"/>
+            <w:tcMar>
+              <w:top w:w="80" w:type="dxa"/>
+              <w:start w:w="120" w:type="dxa"/>
+              <w:bottom w:w="80" w:type="dxa"/>
+              <w:end w:w="120" w:type="dxa"/>
+            </w:tcMar>
             <w:vAlign w:val="center"/>
           </w:tcPr>
           <w:p>
-            <w:pPr>
-              <w:spacing w:after="60"/>
-            </w:pPr>
             <w:r>
-              <w:rPr>
-                <w:rFonts w:ascii="Calibri" w:hAnsi="Calibri"/>
-                <w:sz w:val="20"/>
-              </w:rPr>
-              <w:t>DEMO PASS, offline noninteractive, 7771ms</w:t>
+              <w:t>12</w:t>
             </w:r>
           </w:p>
         </w:tc>
@@ -1453,37 +1358,35 @@
       <w:tr>
         <w:tc>
           <w:tcPr>
-            <w:tcW w:type="dxa" w:w="2880"/>
+            <w:tcW w:type="dxa" w:w="4320"/>
+            <w:tcMar>
+              <w:top w:w="80" w:type="dxa"/>
+              <w:start w:w="120" w:type="dxa"/>
+              <w:bottom w:w="80" w:type="dxa"/>
+              <w:end w:w="120" w:type="dxa"/>
+            </w:tcMar>
             <w:vAlign w:val="center"/>
           </w:tcPr>
           <w:p>
-            <w:pPr>
-              <w:spacing w:after="60"/>
-            </w:pPr>
             <w:r>
-              <w:rPr>
-                <w:rFonts w:ascii="Calibri" w:hAnsi="Calibri"/>
-                <w:sz w:val="20"/>
-              </w:rPr>
-              <w:t>Build dist</w:t>
+              <w:t>product</w:t>
             </w:r>
           </w:p>
         </w:tc>
         <w:tc>
           <w:tcPr>
-            <w:tcW w:type="dxa" w:w="6480"/>
+            <w:tcW w:type="dxa" w:w="1728"/>
+            <w:tcMar>
+              <w:top w:w="80" w:type="dxa"/>
+              <w:start w:w="120" w:type="dxa"/>
+              <w:bottom w:w="80" w:type="dxa"/>
+              <w:end w:w="120" w:type="dxa"/>
+            </w:tcMar>
             <w:vAlign w:val="center"/>
           </w:tcPr>
           <w:p>
-            <w:pPr>
-              <w:spacing w:after="60"/>
-            </w:pPr>
             <w:r>
-              <w:rPr>
-                <w:rFonts w:ascii="Calibri" w:hAnsi="Calibri"/>
-                <w:sz w:val="20"/>
-              </w:rPr>
-              <w:t>receipt=9451361764cef862ea05dbe7801f799097d055e0d566b48cb7566d87b8500421; package=08928f14a849ebc4d381e6b77cc09c6da08fc601d736f3145201c8ce57290d9a</w:t>
+              <w:t>8</w:t>
             </w:r>
           </w:p>
         </w:tc>
@@ -1491,37 +1394,35 @@
       <w:tr>
         <w:tc>
           <w:tcPr>
-            <w:tcW w:type="dxa" w:w="2880"/>
+            <w:tcW w:type="dxa" w:w="4320"/>
+            <w:tcMar>
+              <w:top w:w="80" w:type="dxa"/>
+              <w:start w:w="120" w:type="dxa"/>
+              <w:bottom w:w="80" w:type="dxa"/>
+              <w:end w:w="120" w:type="dxa"/>
+            </w:tcMar>
             <w:vAlign w:val="center"/>
           </w:tcPr>
           <w:p>
-            <w:pPr>
-              <w:spacing w:after="60"/>
-            </w:pPr>
             <w:r>
-              <w:rPr>
-                <w:rFonts w:ascii="Calibri" w:hAnsi="Calibri"/>
-                <w:sz w:val="20"/>
-              </w:rPr>
-              <w:t>Dist smoke</w:t>
+              <w:t>security</w:t>
             </w:r>
           </w:p>
         </w:tc>
         <w:tc>
           <w:tcPr>
-            <w:tcW w:type="dxa" w:w="6480"/>
+            <w:tcW w:type="dxa" w:w="1728"/>
+            <w:tcMar>
+              <w:top w:w="80" w:type="dxa"/>
+              <w:start w:w="120" w:type="dxa"/>
+              <w:bottom w:w="80" w:type="dxa"/>
+              <w:end w:w="120" w:type="dxa"/>
+            </w:tcMar>
             <w:vAlign w:val="center"/>
           </w:tcPr>
           <w:p>
-            <w:pPr>
-              <w:spacing w:after="60"/>
-            </w:pPr>
             <w:r>
-              <w:rPr>
-                <w:rFonts w:ascii="Calibri" w:hAnsi="Calibri"/>
-                <w:sz w:val="20"/>
-              </w:rPr>
-              <w:t>3 tests passed</w:t>
+              <w:t>12</w:t>
             </w:r>
           </w:p>
         </w:tc>
@@ -1529,75 +1430,35 @@
       <w:tr>
         <w:tc>
           <w:tcPr>
-            <w:tcW w:type="dxa" w:w="2880"/>
+            <w:tcW w:type="dxa" w:w="4320"/>
+            <w:tcMar>
+              <w:top w:w="80" w:type="dxa"/>
+              <w:start w:w="120" w:type="dxa"/>
+              <w:bottom w:w="80" w:type="dxa"/>
+              <w:end w:w="120" w:type="dxa"/>
+            </w:tcMar>
             <w:vAlign w:val="center"/>
           </w:tcPr>
           <w:p>
-            <w:pPr>
-              <w:spacing w:after="60"/>
-            </w:pPr>
             <w:r>
-              <w:rPr>
-                <w:rFonts w:ascii="Calibri" w:hAnsi="Calibri"/>
-                <w:sz w:val="20"/>
-              </w:rPr>
-              <w:t>Host validation</w:t>
+              <w:t>testing</w:t>
             </w:r>
           </w:p>
         </w:tc>
         <w:tc>
           <w:tcPr>
-            <w:tcW w:type="dxa" w:w="6480"/>
+            <w:tcW w:type="dxa" w:w="1728"/>
+            <w:tcMar>
+              <w:top w:w="80" w:type="dxa"/>
+              <w:start w:w="120" w:type="dxa"/>
+              <w:bottom w:w="80" w:type="dxa"/>
+              <w:end w:w="120" w:type="dxa"/>
+            </w:tcMar>
             <w:vAlign w:val="center"/>
           </w:tcPr>
           <w:p>
-            <w:pPr>
-              <w:spacing w:after="60"/>
-            </w:pPr>
             <w:r>
-              <w:rPr>
-                <w:rFonts w:ascii="Calibri" w:hAnsi="Calibri"/>
-                <w:sz w:val="20"/>
-              </w:rPr>
-              <w:t>Root, plugins/skillsforge, and dist/claude-code passed claude plugin validate --strict</w:t>
-            </w:r>
-          </w:p>
-        </w:tc>
-      </w:tr>
-      <w:tr>
-        <w:tc>
-          <w:tcPr>
-            <w:tcW w:type="dxa" w:w="2880"/>
-            <w:vAlign w:val="center"/>
-          </w:tcPr>
-          <w:p>
-            <w:pPr>
-              <w:spacing w:after="60"/>
-            </w:pPr>
-            <w:r>
-              <w:rPr>
-                <w:rFonts w:ascii="Calibri" w:hAnsi="Calibri"/>
-                <w:sz w:val="20"/>
-              </w:rPr>
-              <w:t>Evidence bundle</w:t>
-            </w:r>
-          </w:p>
-        </w:tc>
-        <w:tc>
-          <w:tcPr>
-            <w:tcW w:type="dxa" w:w="6480"/>
-            <w:vAlign w:val="center"/>
-          </w:tcPr>
-          <w:p>
-            <w:pPr>
-              <w:spacing w:after="60"/>
-            </w:pPr>
-            <w:r>
-              <w:rPr>
-                <w:rFonts w:ascii="Calibri" w:hAnsi="Calibri"/>
-                <w:sz w:val="20"/>
-              </w:rPr>
-              <w:t>bundleHash=b03151732d4c6665344d454d4a00d4016662b7a8babdfd53ad321442d274531e</w:t>
+              <w:t>12</w:t>
             </w:r>
           </w:p>
         </w:tc>
@@ -1609,12 +1470,12 @@
         <w:pStyle w:val="Heading1"/>
       </w:pPr>
       <w:r>
-        <w:t>8. Hackathon pitch lessons applied</w:t>
+        <w:t>5. UI And Media Choices</w:t>
       </w:r>
     </w:p>
     <w:p>
       <w:r>
-        <w:t>The demo and README were revised around publicly documented judging and submission guidance, not invented winning formulas. The applied rules are practical: open with the problem, show the working product, map evidence to judging criteria, include a reviewable video artifact, and state future scope without hiding limits.</w:t>
+        <w:t>The library UI is a local developer tool, not a cloud dashboard. The design direction follows GitHub/Primer-style density and Radix-style accessible controls: high information density, narrow side rail, searchable rows, sticky detail panel, explicit host and risk metadata, and reduced-motion fallback. Framer and Figma dashboard galleries were used only as layout inspiration, not copied templates or runtime dependencies.</w:t>
       </w:r>
     </w:p>
     <w:tbl>
@@ -1622,7 +1483,6 @@
         <w:tblStyle w:val="TableGrid"/>
         <w:tblW w:type="auto" w:w="0"/>
         <w:jc w:val="left"/>
-        <w:tblLayout w:type="fixed"/>
         <w:tblLook w:firstColumn="1" w:firstRow="1" w:lastColumn="0" w:lastRow="0" w:noHBand="0" w:noVBand="1" w:val="04A0"/>
       </w:tblPr>
       <w:tblGrid>
@@ -1632,43 +1492,43 @@
       <w:tr>
         <w:tc>
           <w:tcPr>
-            <w:tcW w:type="dxa" w:w="3311"/>
+            <w:tcW w:type="dxa" w:w="2880"/>
+            <w:shd w:fill="E8EEF5"/>
+            <w:tcMar>
+              <w:top w:w="80" w:type="dxa"/>
+              <w:start w:w="120" w:type="dxa"/>
+              <w:bottom w:w="80" w:type="dxa"/>
+              <w:end w:w="120" w:type="dxa"/>
+            </w:tcMar>
             <w:vAlign w:val="center"/>
-            <w:shd w:fill="F2F4F7"/>
           </w:tcPr>
           <w:p>
-            <w:pPr>
-              <w:spacing w:after="60"/>
-            </w:pPr>
             <w:r>
               <w:rPr>
-                <w:rFonts w:ascii="Calibri" w:hAnsi="Calibri"/>
                 <w:b/>
-                <w:color w:val="0B2545"/>
-                <w:sz w:val="20"/>
               </w:rPr>
-              <w:t>Source</w:t>
+              <w:t>Asset</w:t>
             </w:r>
           </w:p>
         </w:tc>
         <w:tc>
           <w:tcPr>
-            <w:tcW w:type="dxa" w:w="6048"/>
+            <w:tcW w:type="dxa" w:w="6480"/>
+            <w:shd w:fill="E8EEF5"/>
+            <w:tcMar>
+              <w:top w:w="80" w:type="dxa"/>
+              <w:start w:w="120" w:type="dxa"/>
+              <w:bottom w:w="80" w:type="dxa"/>
+              <w:end w:w="120" w:type="dxa"/>
+            </w:tcMar>
             <w:vAlign w:val="center"/>
-            <w:shd w:fill="F2F4F7"/>
           </w:tcPr>
           <w:p>
-            <w:pPr>
-              <w:spacing w:after="60"/>
-            </w:pPr>
             <w:r>
               <w:rPr>
-                <w:rFonts w:ascii="Calibri" w:hAnsi="Calibri"/>
                 <w:b/>
-                <w:color w:val="0B2545"/>
-                <w:sz w:val="20"/>
               </w:rPr>
-              <w:t>Applied lesson</w:t>
+              <w:t>Status</w:t>
             </w:r>
           </w:p>
         </w:tc>
@@ -1676,37 +1536,35 @@
       <w:tr>
         <w:tc>
           <w:tcPr>
-            <w:tcW w:type="dxa" w:w="3311"/>
+            <w:tcW w:type="dxa" w:w="2880"/>
+            <w:tcMar>
+              <w:top w:w="80" w:type="dxa"/>
+              <w:start w:w="120" w:type="dxa"/>
+              <w:bottom w:w="80" w:type="dxa"/>
+              <w:end w:w="120" w:type="dxa"/>
+            </w:tcMar>
             <w:vAlign w:val="center"/>
           </w:tcPr>
           <w:p>
-            <w:pPr>
-              <w:spacing w:after="60"/>
-            </w:pPr>
             <w:r>
-              <w:rPr>
-                <w:rFonts w:ascii="Calibri" w:hAnsi="Calibri"/>
-                <w:sz w:val="20"/>
-              </w:rPr>
-              <w:t>Devpost demo video guidance</w:t>
+              <w:t>Demo poster</w:t>
             </w:r>
           </w:p>
         </w:tc>
         <w:tc>
           <w:tcPr>
-            <w:tcW w:type="dxa" w:w="6048"/>
+            <w:tcW w:type="dxa" w:w="6480"/>
+            <w:tcMar>
+              <w:top w:w="80" w:type="dxa"/>
+              <w:start w:w="120" w:type="dxa"/>
+              <w:bottom w:w="80" w:type="dxa"/>
+              <w:end w:w="120" w:type="dxa"/>
+            </w:tcMar>
             <w:vAlign w:val="center"/>
           </w:tcPr>
           <w:p>
-            <w:pPr>
-              <w:spacing w:after="60"/>
-            </w:pPr>
             <w:r>
-              <w:rPr>
-                <w:rFonts w:ascii="Calibri" w:hAnsi="Calibri"/>
-                <w:sz w:val="20"/>
-              </w:rPr>
-              <w:t>Show the running product and explain future potential without letting slides replace proof</w:t>
+              <w:t>present</w:t>
             </w:r>
           </w:p>
         </w:tc>
@@ -1714,37 +1572,35 @@
       <w:tr>
         <w:tc>
           <w:tcPr>
-            <w:tcW w:type="dxa" w:w="3311"/>
+            <w:tcW w:type="dxa" w:w="2880"/>
+            <w:tcMar>
+              <w:top w:w="80" w:type="dxa"/>
+              <w:start w:w="120" w:type="dxa"/>
+              <w:bottom w:w="80" w:type="dxa"/>
+              <w:end w:w="120" w:type="dxa"/>
+            </w:tcMar>
             <w:vAlign w:val="center"/>
           </w:tcPr>
           <w:p>
-            <w:pPr>
-              <w:spacing w:after="60"/>
-            </w:pPr>
             <w:r>
-              <w:rPr>
-                <w:rFonts w:ascii="Calibri" w:hAnsi="Calibri"/>
-                <w:sz w:val="20"/>
-              </w:rPr>
-              <w:t>Devpost submission steps</w:t>
+              <w:t>Demo MP4</w:t>
             </w:r>
           </w:p>
         </w:tc>
         <w:tc>
           <w:tcPr>
-            <w:tcW w:type="dxa" w:w="6048"/>
+            <w:tcW w:type="dxa" w:w="6480"/>
+            <w:tcMar>
+              <w:top w:w="80" w:type="dxa"/>
+              <w:start w:w="120" w:type="dxa"/>
+              <w:bottom w:w="80" w:type="dxa"/>
+              <w:end w:w="120" w:type="dxa"/>
+            </w:tcMar>
             <w:vAlign w:val="center"/>
           </w:tcPr>
           <w:p>
-            <w:pPr>
-              <w:spacing w:after="60"/>
-            </w:pPr>
             <w:r>
-              <w:rPr>
-                <w:rFonts w:ascii="Calibri" w:hAnsi="Calibri"/>
-                <w:sz w:val="20"/>
-              </w:rPr>
-              <w:t>Use a public video/gallery artifact and make submission evidence easy to review</w:t>
+              <w:t>present, 6833441 bytes</w:t>
             </w:r>
           </w:p>
         </w:tc>
@@ -1752,37 +1608,35 @@
       <w:tr>
         <w:tc>
           <w:tcPr>
-            <w:tcW w:type="dxa" w:w="3311"/>
+            <w:tcW w:type="dxa" w:w="2880"/>
+            <w:tcMar>
+              <w:top w:w="80" w:type="dxa"/>
+              <w:start w:w="120" w:type="dxa"/>
+              <w:bottom w:w="80" w:type="dxa"/>
+              <w:end w:w="120" w:type="dxa"/>
+            </w:tcMar>
             <w:vAlign w:val="center"/>
           </w:tcPr>
           <w:p>
-            <w:pPr>
-              <w:spacing w:after="60"/>
-            </w:pPr>
             <w:r>
-              <w:rPr>
-                <w:rFonts w:ascii="Calibri" w:hAnsi="Calibri"/>
-                <w:sz w:val="20"/>
-              </w:rPr>
-              <w:t>MLH rules</w:t>
+              <w:t>Star map SVG</w:t>
             </w:r>
           </w:p>
         </w:tc>
         <w:tc>
           <w:tcPr>
-            <w:tcW w:type="dxa" w:w="6048"/>
+            <w:tcW w:type="dxa" w:w="6480"/>
+            <w:tcMar>
+              <w:top w:w="80" w:type="dxa"/>
+              <w:start w:w="120" w:type="dxa"/>
+              <w:bottom w:w="80" w:type="dxa"/>
+              <w:end w:w="120" w:type="dxa"/>
+            </w:tcMar>
             <w:vAlign w:val="center"/>
           </w:tcPr>
           <w:p>
-            <w:pPr>
-              <w:spacing w:after="60"/>
-            </w:pPr>
             <w:r>
-              <w:rPr>
-                <w:rFonts w:ascii="Calibri" w:hAnsi="Calibri"/>
-                <w:sz w:val="20"/>
-              </w:rPr>
-              <w:t>During judging, describe what was done for each criterion instead of relying on general claims</w:t>
+              <w:t>present</w:t>
             </w:r>
           </w:p>
         </w:tc>
@@ -1790,442 +1644,35 @@
       <w:tr>
         <w:tc>
           <w:tcPr>
-            <w:tcW w:type="dxa" w:w="3311"/>
+            <w:tcW w:type="dxa" w:w="2880"/>
+            <w:tcMar>
+              <w:top w:w="80" w:type="dxa"/>
+              <w:start w:w="120" w:type="dxa"/>
+              <w:bottom w:w="80" w:type="dxa"/>
+              <w:end w:w="120" w:type="dxa"/>
+            </w:tcMar>
             <w:vAlign w:val="center"/>
           </w:tcPr>
           <w:p>
-            <w:pPr>
-              <w:spacing w:after="60"/>
-            </w:pPr>
             <w:r>
-              <w:rPr>
-                <w:rFonts w:ascii="Calibri" w:hAnsi="Calibri"/>
-                <w:sz w:val="20"/>
-              </w:rPr>
-              <w:t>JetBrains judge notes</w:t>
+              <w:t>README video approach</w:t>
             </w:r>
           </w:p>
         </w:tc>
         <w:tc>
           <w:tcPr>
-            <w:tcW w:type="dxa" w:w="6048"/>
+            <w:tcW w:type="dxa" w:w="6480"/>
+            <w:tcMar>
+              <w:top w:w="80" w:type="dxa"/>
+              <w:start w:w="120" w:type="dxa"/>
+              <w:bottom w:w="80" w:type="dxa"/>
+              <w:end w:w="120" w:type="dxa"/>
+            </w:tcMar>
             <w:vAlign w:val="center"/>
           </w:tcPr>
           <w:p>
-            <w:pPr>
-              <w:spacing w:after="60"/>
-            </w:pPr>
             <w:r>
-              <w:rPr>
-                <w:rFonts w:ascii="Calibri" w:hAnsi="Calibri"/>
-                <w:sz w:val="20"/>
-              </w:rPr>
-              <w:t>Start with the problem and understand the judges before showing implementation detail</w:t>
-            </w:r>
-          </w:p>
-        </w:tc>
-      </w:tr>
-    </w:tbl>
-    <w:p/>
-    <w:p>
-      <w:r>
-        <w:t>Source URLs:</w:t>
-      </w:r>
-    </w:p>
-    <w:p>
-      <w:pPr>
-        <w:pStyle w:val="ListBullet"/>
-      </w:pPr>
-      <w:r>
-        <w:t>https://info.devpost.com/blog/6-tips-for-making-a-hackathon-demo-video</w:t>
-      </w:r>
-    </w:p>
-    <w:p>
-      <w:pPr>
-        <w:pStyle w:val="ListBullet"/>
-      </w:pPr>
-      <w:r>
-        <w:t>https://help.devpost.com/article/126-know-your-submission-steps</w:t>
-      </w:r>
-    </w:p>
-    <w:p>
-      <w:pPr>
-        <w:pStyle w:val="ListBullet"/>
-      </w:pPr>
-      <w:r>
-        <w:t>https://github.com/MLH/mlh-hackathon-rules/blob/master/Rules.md</w:t>
-      </w:r>
-    </w:p>
-    <w:p>
-      <w:pPr>
-        <w:pStyle w:val="ListBullet"/>
-      </w:pPr>
-      <w:r>
-        <w:t>https://blog.jetbrains.com/ai/2026/06/how-to-win-a-hackathon-notes-from-the-judging-table/</w:t>
-      </w:r>
-    </w:p>
-    <w:p>
-      <w:pPr>
-        <w:pStyle w:val="Heading1"/>
-      </w:pPr>
-      <w:r>
-        <w:t>9. Remaining risks and roadmap</w:t>
-      </w:r>
-    </w:p>
-    <w:tbl>
-      <w:tblPr>
-        <w:tblStyle w:val="TableGrid"/>
-        <w:tblW w:type="auto" w:w="0"/>
-        <w:jc w:val="left"/>
-        <w:tblLayout w:type="fixed"/>
-        <w:tblLook w:firstColumn="1" w:firstRow="1" w:lastColumn="0" w:lastRow="0" w:noHBand="0" w:noVBand="1" w:val="04A0"/>
-      </w:tblPr>
-      <w:tblGrid>
-        <w:gridCol w:w="3120"/>
-        <w:gridCol w:w="3120"/>
-        <w:gridCol w:w="3120"/>
-      </w:tblGrid>
-      <w:tr>
-        <w:tc>
-          <w:tcPr>
-            <w:tcW w:type="dxa" w:w="2232"/>
-            <w:vAlign w:val="center"/>
-            <w:shd w:fill="F2F4F7"/>
-          </w:tcPr>
-          <w:p>
-            <w:pPr>
-              <w:spacing w:after="60"/>
-            </w:pPr>
-            <w:r>
-              <w:rPr>
-                <w:rFonts w:ascii="Calibri" w:hAnsi="Calibri"/>
-                <w:b/>
-                <w:color w:val="0B2545"/>
-                <w:sz w:val="20"/>
-              </w:rPr>
-              <w:t>Risk</w:t>
-            </w:r>
-          </w:p>
-        </w:tc>
-        <w:tc>
-          <w:tcPr>
-            <w:tcW w:type="dxa" w:w="3528"/>
-            <w:vAlign w:val="center"/>
-            <w:shd w:fill="F2F4F7"/>
-          </w:tcPr>
-          <w:p>
-            <w:pPr>
-              <w:spacing w:after="60"/>
-            </w:pPr>
-            <w:r>
-              <w:rPr>
-                <w:rFonts w:ascii="Calibri" w:hAnsi="Calibri"/>
-                <w:b/>
-                <w:color w:val="0B2545"/>
-                <w:sz w:val="20"/>
-              </w:rPr>
-              <w:t>Current mitigation</w:t>
-            </w:r>
-          </w:p>
-        </w:tc>
-        <w:tc>
-          <w:tcPr>
-            <w:tcW w:type="dxa" w:w="3600"/>
-            <w:vAlign w:val="center"/>
-            <w:shd w:fill="F2F4F7"/>
-          </w:tcPr>
-          <w:p>
-            <w:pPr>
-              <w:spacing w:after="60"/>
-            </w:pPr>
-            <w:r>
-              <w:rPr>
-                <w:rFonts w:ascii="Calibri" w:hAnsi="Calibri"/>
-                <w:b/>
-                <w:color w:val="0B2545"/>
-                <w:sz w:val="20"/>
-              </w:rPr>
-              <w:t>Next step</w:t>
-            </w:r>
-          </w:p>
-        </w:tc>
-      </w:tr>
-      <w:tr>
-        <w:tc>
-          <w:tcPr>
-            <w:tcW w:type="dxa" w:w="2232"/>
-            <w:vAlign w:val="center"/>
-          </w:tcPr>
-          <w:p>
-            <w:pPr>
-              <w:spacing w:after="60"/>
-            </w:pPr>
-            <w:r>
-              <w:rPr>
-                <w:rFonts w:ascii="Calibri" w:hAnsi="Calibri"/>
-                <w:sz w:val="20"/>
-              </w:rPr>
-              <w:t>Hooks are not OS sandboxing</w:t>
-            </w:r>
-          </w:p>
-        </w:tc>
-        <w:tc>
-          <w:tcPr>
-            <w:tcW w:type="dxa" w:w="3528"/>
-            <w:vAlign w:val="center"/>
-          </w:tcPr>
-          <w:p>
-            <w:pPr>
-              <w:spacing w:after="60"/>
-            </w:pPr>
-            <w:r>
-              <w:rPr>
-                <w:rFonts w:ascii="Calibri" w:hAnsi="Calibri"/>
-                <w:sz w:val="20"/>
-              </w:rPr>
-              <w:t>Threat model states host guardrail boundary</w:t>
-            </w:r>
-          </w:p>
-        </w:tc>
-        <w:tc>
-          <w:tcPr>
-            <w:tcW w:type="dxa" w:w="3600"/>
-            <w:vAlign w:val="center"/>
-          </w:tcPr>
-          <w:p>
-            <w:pPr>
-              <w:spacing w:after="60"/>
-            </w:pPr>
-            <w:r>
-              <w:rPr>
-                <w:rFonts w:ascii="Calibri" w:hAnsi="Calibri"/>
-                <w:sz w:val="20"/>
-              </w:rPr>
-              <w:t>Offer container/VM recipes for untrusted code execution</w:t>
-            </w:r>
-          </w:p>
-        </w:tc>
-      </w:tr>
-      <w:tr>
-        <w:tc>
-          <w:tcPr>
-            <w:tcW w:type="dxa" w:w="2232"/>
-            <w:vAlign w:val="center"/>
-          </w:tcPr>
-          <w:p>
-            <w:pPr>
-              <w:spacing w:after="60"/>
-            </w:pPr>
-            <w:r>
-              <w:rPr>
-                <w:rFonts w:ascii="Calibri" w:hAnsi="Calibri"/>
-                <w:sz w:val="20"/>
-              </w:rPr>
-              <w:t>Package-fidelity hosts do not enforce runtime policy</w:t>
-            </w:r>
-          </w:p>
-        </w:tc>
-        <w:tc>
-          <w:tcPr>
-            <w:tcW w:type="dxa" w:w="3528"/>
-            <w:vAlign w:val="center"/>
-          </w:tcPr>
-          <w:p>
-            <w:pPr>
-              <w:spacing w:after="60"/>
-            </w:pPr>
-            <w:r>
-              <w:rPr>
-                <w:rFonts w:ascii="Calibri" w:hAnsi="Calibri"/>
-                <w:sz w:val="20"/>
-              </w:rPr>
-              <w:t>README, hosts command, and docs say no runtime parity claim</w:t>
-            </w:r>
-          </w:p>
-        </w:tc>
-        <w:tc>
-          <w:tcPr>
-            <w:tcW w:type="dxa" w:w="3600"/>
-            <w:vAlign w:val="center"/>
-          </w:tcPr>
-          <w:p>
-            <w:pPr>
-              <w:spacing w:after="60"/>
-            </w:pPr>
-            <w:r>
-              <w:rPr>
-                <w:rFonts w:ascii="Calibri" w:hAnsi="Calibri"/>
-                <w:sz w:val="20"/>
-              </w:rPr>
-              <w:t>Add host adapters only when a host exposes a real policy hook API</w:t>
-            </w:r>
-          </w:p>
-        </w:tc>
-      </w:tr>
-      <w:tr>
-        <w:tc>
-          <w:tcPr>
-            <w:tcW w:type="dxa" w:w="2232"/>
-            <w:vAlign w:val="center"/>
-          </w:tcPr>
-          <w:p>
-            <w:pPr>
-              <w:spacing w:after="60"/>
-            </w:pPr>
-            <w:r>
-              <w:rPr>
-                <w:rFonts w:ascii="Calibri" w:hAnsi="Calibri"/>
-                <w:sz w:val="20"/>
-              </w:rPr>
-              <w:t>Static scan is best-effort</w:t>
-            </w:r>
-          </w:p>
-        </w:tc>
-        <w:tc>
-          <w:tcPr>
-            <w:tcW w:type="dxa" w:w="3528"/>
-            <w:vAlign w:val="center"/>
-          </w:tcPr>
-          <w:p>
-            <w:pPr>
-              <w:spacing w:after="60"/>
-            </w:pPr>
-            <w:r>
-              <w:rPr>
-                <w:rFonts w:ascii="Calibri" w:hAnsi="Calibri"/>
-                <w:sz w:val="20"/>
-              </w:rPr>
-              <w:t>Policy fixtures, SkillShield, and evidence receipts</w:t>
-            </w:r>
-          </w:p>
-        </w:tc>
-        <w:tc>
-          <w:tcPr>
-            <w:tcW w:type="dxa" w:w="3600"/>
-            <w:vAlign w:val="center"/>
-          </w:tcPr>
-          <w:p>
-            <w:pPr>
-              <w:spacing w:after="60"/>
-            </w:pPr>
-            <w:r>
-              <w:rPr>
-                <w:rFonts w:ascii="Calibri" w:hAnsi="Calibri"/>
-                <w:sz w:val="20"/>
-              </w:rPr>
-              <w:t>Add more adversarial fixtures and optional binary provenance checks</w:t>
-            </w:r>
-          </w:p>
-        </w:tc>
-      </w:tr>
-      <w:tr>
-        <w:tc>
-          <w:tcPr>
-            <w:tcW w:type="dxa" w:w="2232"/>
-            <w:vAlign w:val="center"/>
-          </w:tcPr>
-          <w:p>
-            <w:pPr>
-              <w:spacing w:after="60"/>
-            </w:pPr>
-            <w:r>
-              <w:rPr>
-                <w:rFonts w:ascii="Calibri" w:hAnsi="Calibri"/>
-                <w:sz w:val="20"/>
-              </w:rPr>
-              <w:t>Catalog depth varies by pack</w:t>
-            </w:r>
-          </w:p>
-        </w:tc>
-        <w:tc>
-          <w:tcPr>
-            <w:tcW w:type="dxa" w:w="3528"/>
-            <w:vAlign w:val="center"/>
-          </w:tcPr>
-          <w:p>
-            <w:pPr>
-              <w:spacing w:after="60"/>
-            </w:pPr>
-            <w:r>
-              <w:rPr>
-                <w:rFonts w:ascii="Calibri" w:hAnsi="Calibri"/>
-                <w:sz w:val="20"/>
-              </w:rPr>
-              <w:t>README says trust skills are deeper and domain packs are lean</w:t>
-            </w:r>
-          </w:p>
-        </w:tc>
-        <w:tc>
-          <w:tcPr>
-            <w:tcW w:type="dxa" w:w="3600"/>
-            <w:vAlign w:val="center"/>
-          </w:tcPr>
-          <w:p>
-            <w:pPr>
-              <w:spacing w:after="60"/>
-            </w:pPr>
-            <w:r>
-              <w:rPr>
-                <w:rFonts w:ascii="Calibri" w:hAnsi="Calibri"/>
-                <w:sz w:val="20"/>
-              </w:rPr>
-              <w:t>Expand high-value domain skills with examples/evals after hackathon</w:t>
-            </w:r>
-          </w:p>
-        </w:tc>
-      </w:tr>
-      <w:tr>
-        <w:tc>
-          <w:tcPr>
-            <w:tcW w:type="dxa" w:w="2232"/>
-            <w:vAlign w:val="center"/>
-          </w:tcPr>
-          <w:p>
-            <w:pPr>
-              <w:spacing w:after="60"/>
-            </w:pPr>
-            <w:r>
-              <w:rPr>
-                <w:rFonts w:ascii="Calibri" w:hAnsi="Calibri"/>
-                <w:sz w:val="20"/>
-              </w:rPr>
-              <w:t>Receipts are unsigned</w:t>
-            </w:r>
-          </w:p>
-        </w:tc>
-        <w:tc>
-          <w:tcPr>
-            <w:tcW w:type="dxa" w:w="3528"/>
-            <w:vAlign w:val="center"/>
-          </w:tcPr>
-          <w:p>
-            <w:pPr>
-              <w:spacing w:after="60"/>
-            </w:pPr>
-            <w:r>
-              <w:rPr>
-                <w:rFonts w:ascii="Calibri" w:hAnsi="Calibri"/>
-                <w:sz w:val="20"/>
-              </w:rPr>
-              <w:t>Docs call them tamper evidence, not certification</w:t>
-            </w:r>
-          </w:p>
-        </w:tc>
-        <w:tc>
-          <w:tcPr>
-            <w:tcW w:type="dxa" w:w="3600"/>
-            <w:vAlign w:val="center"/>
-          </w:tcPr>
-          <w:p>
-            <w:pPr>
-              <w:spacing w:after="60"/>
-            </w:pPr>
-            <w:r>
-              <w:rPr>
-                <w:rFonts w:ascii="Calibri" w:hAnsi="Calibri"/>
-                <w:sz w:val="20"/>
-              </w:rPr>
-              <w:t>Add optional signing and provenance attestations later</w:t>
+              <w:t>poster visible in README; MP4 committed as direct raw/download target</w:t>
             </w:r>
           </w:p>
         </w:tc>
@@ -2237,47 +1684,411 @@
         <w:pStyle w:val="Heading1"/>
       </w:pPr>
       <w:r>
-        <w:t>10. Delivery inventory</w:t>
+        <w:t>6. Verification Evidence</w:t>
       </w:r>
     </w:p>
     <w:p>
+      <w:r>
+        <w:t>The final gate was run from the repository root on 2026-07-18. The results below are command outputs from local verification, not invented benchmark claims.</w:t>
+      </w:r>
+    </w:p>
+    <w:tbl>
+      <w:tblPr>
+        <w:tblStyle w:val="TableGrid"/>
+        <w:tblW w:type="auto" w:w="0"/>
+        <w:jc w:val="left"/>
+        <w:tblLook w:firstColumn="1" w:firstRow="1" w:lastColumn="0" w:lastRow="0" w:noHBand="0" w:noVBand="1" w:val="04A0"/>
+      </w:tblPr>
+      <w:tblGrid>
+        <w:gridCol w:w="4680"/>
+        <w:gridCol w:w="4680"/>
+      </w:tblGrid>
+      <w:tr>
+        <w:tc>
+          <w:tcPr>
+            <w:tcW w:type="dxa" w:w="3168"/>
+            <w:shd w:fill="E8EEF5"/>
+            <w:tcMar>
+              <w:top w:w="80" w:type="dxa"/>
+              <w:start w:w="120" w:type="dxa"/>
+              <w:bottom w:w="80" w:type="dxa"/>
+              <w:end w:w="120" w:type="dxa"/>
+            </w:tcMar>
+            <w:vAlign w:val="center"/>
+          </w:tcPr>
+          <w:p>
+            <w:r>
+              <w:rPr>
+                <w:b/>
+              </w:rPr>
+              <w:t>Gate</w:t>
+            </w:r>
+          </w:p>
+        </w:tc>
+        <w:tc>
+          <w:tcPr>
+            <w:tcW w:type="dxa" w:w="6192"/>
+            <w:shd w:fill="E8EEF5"/>
+            <w:tcMar>
+              <w:top w:w="80" w:type="dxa"/>
+              <w:start w:w="120" w:type="dxa"/>
+              <w:bottom w:w="80" w:type="dxa"/>
+              <w:end w:w="120" w:type="dxa"/>
+            </w:tcMar>
+            <w:vAlign w:val="center"/>
+          </w:tcPr>
+          <w:p>
+            <w:r>
+              <w:rPr>
+                <w:b/>
+              </w:rPr>
+              <w:t>Result</w:t>
+            </w:r>
+          </w:p>
+        </w:tc>
+      </w:tr>
+      <w:tr>
+        <w:tc>
+          <w:tcPr>
+            <w:tcW w:type="dxa" w:w="3168"/>
+            <w:tcMar>
+              <w:top w:w="80" w:type="dxa"/>
+              <w:start w:w="120" w:type="dxa"/>
+              <w:bottom w:w="80" w:type="dxa"/>
+              <w:end w:w="120" w:type="dxa"/>
+            </w:tcMar>
+            <w:vAlign w:val="center"/>
+          </w:tcPr>
+          <w:p>
+            <w:r>
+              <w:t>node --test targeted set</w:t>
+            </w:r>
+          </w:p>
+        </w:tc>
+        <w:tc>
+          <w:tcPr>
+            <w:tcW w:type="dxa" w:w="6192"/>
+            <w:tcMar>
+              <w:top w:w="80" w:type="dxa"/>
+              <w:start w:w="120" w:type="dxa"/>
+              <w:bottom w:w="80" w:type="dxa"/>
+              <w:end w:w="120" w:type="dxa"/>
+            </w:tcMar>
+            <w:vAlign w:val="center"/>
+          </w:tcPr>
+          <w:p>
+            <w:r>
+              <w:t>23 tests passed for CLI/workflows/library/MCP/PowerShell safety</w:t>
+            </w:r>
+          </w:p>
+        </w:tc>
+      </w:tr>
+      <w:tr>
+        <w:tc>
+          <w:tcPr>
+            <w:tcW w:type="dxa" w:w="3168"/>
+            <w:tcMar>
+              <w:top w:w="80" w:type="dxa"/>
+              <w:start w:w="120" w:type="dxa"/>
+              <w:bottom w:w="80" w:type="dxa"/>
+              <w:end w:w="120" w:type="dxa"/>
+            </w:tcMar>
+            <w:vAlign w:val="center"/>
+          </w:tcPr>
+          <w:p>
+            <w:r>
+              <w:t>npm run check</w:t>
+            </w:r>
+          </w:p>
+        </w:tc>
+        <w:tc>
+          <w:tcPr>
+            <w:tcW w:type="dxa" w:w="6192"/>
+            <w:tcMar>
+              <w:top w:w="80" w:type="dxa"/>
+              <w:start w:w="120" w:type="dxa"/>
+              <w:bottom w:w="80" w:type="dxa"/>
+              <w:end w:w="120" w:type="dxa"/>
+            </w:tcMar>
+            <w:vAlign w:val="center"/>
+          </w:tcPr>
+          <w:p>
+            <w:r>
+              <w:t>pass; 226 tests, eval, demo, build check, dist build, dist smoke, host validation, evidence</w:t>
+            </w:r>
+          </w:p>
+        </w:tc>
+      </w:tr>
+      <w:tr>
+        <w:tc>
+          <w:tcPr>
+            <w:tcW w:type="dxa" w:w="3168"/>
+            <w:tcMar>
+              <w:top w:w="80" w:type="dxa"/>
+              <w:start w:w="120" w:type="dxa"/>
+              <w:bottom w:w="80" w:type="dxa"/>
+              <w:end w:w="120" w:type="dxa"/>
+            </w:tcMar>
+            <w:vAlign w:val="center"/>
+          </w:tcPr>
+          <w:p>
+            <w:r>
+              <w:t>Routing eval</w:t>
+            </w:r>
+          </w:p>
+        </w:tc>
+        <w:tc>
+          <w:tcPr>
+            <w:tcW w:type="dxa" w:w="6192"/>
+            <w:tcMar>
+              <w:top w:w="80" w:type="dxa"/>
+              <w:start w:w="120" w:type="dxa"/>
+              <w:bottom w:w="80" w:type="dxa"/>
+              <w:end w:w="120" w:type="dxa"/>
+            </w:tcMar>
+            <w:vAlign w:val="center"/>
+          </w:tcPr>
+          <w:p>
+            <w:r>
+              <w:t>exact=1.00, precision=1.00, recall=1.00 on frozen local corpus</w:t>
+            </w:r>
+          </w:p>
+        </w:tc>
+      </w:tr>
+      <w:tr>
+        <w:tc>
+          <w:tcPr>
+            <w:tcW w:type="dxa" w:w="3168"/>
+            <w:tcMar>
+              <w:top w:w="80" w:type="dxa"/>
+              <w:start w:w="120" w:type="dxa"/>
+              <w:bottom w:w="80" w:type="dxa"/>
+              <w:end w:w="120" w:type="dxa"/>
+            </w:tcMar>
+            <w:vAlign w:val="center"/>
+          </w:tcPr>
+          <w:p>
+            <w:r>
+              <w:t>Demo</w:t>
+            </w:r>
+          </w:p>
+        </w:tc>
+        <w:tc>
+          <w:tcPr>
+            <w:tcW w:type="dxa" w:w="6192"/>
+            <w:tcMar>
+              <w:top w:w="80" w:type="dxa"/>
+              <w:start w:w="120" w:type="dxa"/>
+              <w:bottom w:w="80" w:type="dxa"/>
+              <w:end w:w="120" w:type="dxa"/>
+            </w:tcMar>
+            <w:vAlign w:val="center"/>
+          </w:tcPr>
+          <w:p>
+            <w:r>
+              <w:t>offline noninteractive demo pass; unsafe deny -&gt; safe package -&gt; receipt verify</w:t>
+            </w:r>
+          </w:p>
+        </w:tc>
+      </w:tr>
+      <w:tr>
+        <w:tc>
+          <w:tcPr>
+            <w:tcW w:type="dxa" w:w="3168"/>
+            <w:tcMar>
+              <w:top w:w="80" w:type="dxa"/>
+              <w:start w:w="120" w:type="dxa"/>
+              <w:bottom w:w="80" w:type="dxa"/>
+              <w:end w:w="120" w:type="dxa"/>
+            </w:tcMar>
+            <w:vAlign w:val="center"/>
+          </w:tcPr>
+          <w:p>
+            <w:r>
+              <w:t>Host validation</w:t>
+            </w:r>
+          </w:p>
+        </w:tc>
+        <w:tc>
+          <w:tcPr>
+            <w:tcW w:type="dxa" w:w="6192"/>
+            <w:tcMar>
+              <w:top w:w="80" w:type="dxa"/>
+              <w:start w:w="120" w:type="dxa"/>
+              <w:bottom w:w="80" w:type="dxa"/>
+              <w:end w:w="120" w:type="dxa"/>
+            </w:tcMar>
+            <w:vAlign w:val="center"/>
+          </w:tcPr>
+          <w:p>
+            <w:r>
+              <w:t>pass</w:t>
+            </w:r>
+          </w:p>
+        </w:tc>
+      </w:tr>
+      <w:tr>
+        <w:tc>
+          <w:tcPr>
+            <w:tcW w:type="dxa" w:w="3168"/>
+            <w:tcMar>
+              <w:top w:w="80" w:type="dxa"/>
+              <w:start w:w="120" w:type="dxa"/>
+              <w:bottom w:w="80" w:type="dxa"/>
+              <w:end w:w="120" w:type="dxa"/>
+            </w:tcMar>
+            <w:vAlign w:val="center"/>
+          </w:tcPr>
+          <w:p>
+            <w:r>
+              <w:t>Evidence bundle</w:t>
+            </w:r>
+          </w:p>
+        </w:tc>
+        <w:tc>
+          <w:tcPr>
+            <w:tcW w:type="dxa" w:w="6192"/>
+            <w:tcMar>
+              <w:top w:w="80" w:type="dxa"/>
+              <w:start w:w="120" w:type="dxa"/>
+              <w:bottom w:w="80" w:type="dxa"/>
+              <w:end w:w="120" w:type="dxa"/>
+            </w:tcMar>
+            <w:vAlign w:val="center"/>
+          </w:tcPr>
+          <w:p>
+            <w:r>
+              <w:t>d942e272becb4eb9c9d56f0e10042cf2ffda2c5063058b242fb4055a234c202c</w:t>
+            </w:r>
+          </w:p>
+        </w:tc>
+      </w:tr>
+      <w:tr>
+        <w:tc>
+          <w:tcPr>
+            <w:tcW w:type="dxa" w:w="3168"/>
+            <w:tcMar>
+              <w:top w:w="80" w:type="dxa"/>
+              <w:start w:w="120" w:type="dxa"/>
+              <w:bottom w:w="80" w:type="dxa"/>
+              <w:end w:w="120" w:type="dxa"/>
+            </w:tcMar>
+            <w:vAlign w:val="center"/>
+          </w:tcPr>
+          <w:p>
+            <w:r>
+              <w:t>npm audit</w:t>
+            </w:r>
+          </w:p>
+        </w:tc>
+        <w:tc>
+          <w:tcPr>
+            <w:tcW w:type="dxa" w:w="6192"/>
+            <w:tcMar>
+              <w:top w:w="80" w:type="dxa"/>
+              <w:start w:w="120" w:type="dxa"/>
+              <w:bottom w:w="80" w:type="dxa"/>
+              <w:end w:w="120" w:type="dxa"/>
+            </w:tcMar>
+            <w:vAlign w:val="center"/>
+          </w:tcPr>
+          <w:p>
+            <w:r>
+              <w:t>0 low/moderate/high/critical vulnerabilities in package-lock audit</w:t>
+            </w:r>
+          </w:p>
+        </w:tc>
+      </w:tr>
+      <w:tr>
+        <w:tc>
+          <w:tcPr>
+            <w:tcW w:type="dxa" w:w="3168"/>
+            <w:tcMar>
+              <w:top w:w="80" w:type="dxa"/>
+              <w:start w:w="120" w:type="dxa"/>
+              <w:bottom w:w="80" w:type="dxa"/>
+              <w:end w:w="120" w:type="dxa"/>
+            </w:tcMar>
+            <w:vAlign w:val="center"/>
+          </w:tcPr>
+          <w:p>
+            <w:r>
+              <w:t>npm pack --dry-run</w:t>
+            </w:r>
+          </w:p>
+        </w:tc>
+        <w:tc>
+          <w:tcPr>
+            <w:tcW w:type="dxa" w:w="6192"/>
+            <w:tcMar>
+              <w:top w:w="80" w:type="dxa"/>
+              <w:start w:w="120" w:type="dxa"/>
+              <w:bottom w:w="80" w:type="dxa"/>
+              <w:end w:w="120" w:type="dxa"/>
+            </w:tcMar>
+            <w:vAlign w:val="center"/>
+          </w:tcPr>
+          <w:p>
+            <w:r>
+              <w:t>included README, assets, MP4, workflows, library/workbench sources, bundled CLI</w:t>
+            </w:r>
+          </w:p>
+        </w:tc>
+      </w:tr>
+      <w:tr>
+        <w:tc>
+          <w:tcPr>
+            <w:tcW w:type="dxa" w:w="3168"/>
+            <w:tcMar>
+              <w:top w:w="80" w:type="dxa"/>
+              <w:start w:w="120" w:type="dxa"/>
+              <w:bottom w:w="80" w:type="dxa"/>
+              <w:end w:w="120" w:type="dxa"/>
+            </w:tcMar>
+            <w:vAlign w:val="center"/>
+          </w:tcPr>
+          <w:p>
+            <w:r>
+              <w:t>Claim scan</w:t>
+            </w:r>
+          </w:p>
+        </w:tc>
+        <w:tc>
+          <w:tcPr>
+            <w:tcW w:type="dxa" w:w="6192"/>
+            <w:tcMar>
+              <w:top w:w="80" w:type="dxa"/>
+              <w:start w:w="120" w:type="dxa"/>
+              <w:bottom w:w="80" w:type="dxa"/>
+              <w:end w:w="120" w:type="dxa"/>
+            </w:tcMar>
+            <w:vAlign w:val="center"/>
+          </w:tcPr>
+          <w:p>
+            <w:r>
+              <w:t>no Remotion, stale npx, old inventory, or unsupported superiority terms in public docs</w:t>
+            </w:r>
+          </w:p>
+        </w:tc>
+      </w:tr>
+    </w:tbl>
+    <w:p/>
+    <w:p>
       <w:pPr>
-        <w:pStyle w:val="ListBullet"/>
+        <w:pStyle w:val="Heading1"/>
       </w:pPr>
       <w:r>
-        <w:t>Source implementation: lib/capabilities/hosts.mjs and scripts/skillsforge-cli.mjs.</w:t>
+        <w:t>7. Safety Boundaries</w:t>
       </w:r>
     </w:p>
     <w:p>
-      <w:pPr>
-        <w:pStyle w:val="ListBullet"/>
-      </w:pPr>
       <w:r>
-        <w:t>Bundled implementation: plugins/skillsforge/bin/skillsforge.mjs and skillsforge-validate shim.</w:t>
+        <w:t>SkillsForge does not claim OS sandboxing, third-party attestation, swarm consensus, AgentDB, or full runtime policy parity for hosts that only receive copied skill packages. Codex packaging and Claude-style hooks are the strong enforcement paths; other hosts are package-fidelity targets with explicit trust boundaries.</w:t>
       </w:r>
     </w:p>
     <w:p>
-      <w:pPr>
-        <w:pStyle w:val="ListBullet"/>
-      </w:pPr>
       <w:r>
-        <w:t>Tests: tests/hosts.test.mjs, tests/install.test.mjs, tests/cli.test.mjs, tests/os-cli.test.mjs through full suite.</w:t>
-      </w:r>
-    </w:p>
-    <w:p>
-      <w:pPr>
-        <w:pStyle w:val="ListBullet"/>
-      </w:pPr>
-      <w:r>
-        <w:t>Docs and visuals: README.md, assets/skillsforge-universal-fanout.svg, docs/universal-hosts.md, docs/architecture.md, docs/hackathon-demo.md, docs/threat-model.md.</w:t>
-      </w:r>
-    </w:p>
-    <w:p>
-      <w:pPr>
-        <w:pStyle w:val="ListBullet"/>
-      </w:pPr>
-      <w:r>
-        <w:t>Evidence outputs: artifacts/evidence, artifacts/host-validation.json, dist packages and receipts.</w:t>
+        <w:t>All automatic routing commands remain read-only by default. Deleting installed skills requires --allow-mutations and --yes at the CLI, and the local UI requires a second confirmation. Workflow run is dry-run only. Auto run requires --read-only.</w:t>
       </w:r>
     </w:p>
     <w:p>
@@ -2285,17 +2096,271 @@
         <w:pStyle w:val="Heading1"/>
       </w:pPr>
       <w:r>
-        <w:t>11. Final claim boundary</w:t>
+        <w:t>8. Judge Story</w:t>
       </w:r>
     </w:p>
     <w:p>
       <w:r>
-        <w:t>A judge or operator should judge SkillsForge on the visible product path: unsafe deny, safe Codex package, receipt verification, universal host inventory, and dry-run package install. The project should not be described as an OS sandbox, third-party security attestation, or runtime policy layer for hosts that only receive package-fidelity installs.</w:t>
+        <w:t>The strongest demo path is short: run the offline demo, show the unsafe example blocked without executing, package the safe example, verify the receipt, then show the local library/workflow/PowerShell additions as the scale and usability layer. This keeps the pitch factual: trust first, then productivity.</w:t>
+      </w:r>
+    </w:p>
+    <w:tbl>
+      <w:tblPr>
+        <w:tblStyle w:val="TableGrid"/>
+        <w:tblW w:type="auto" w:w="0"/>
+        <w:jc w:val="left"/>
+        <w:tblLook w:firstColumn="1" w:firstRow="1" w:lastColumn="0" w:lastRow="0" w:noHBand="0" w:noVBand="1" w:val="04A0"/>
+      </w:tblPr>
+      <w:tblGrid>
+        <w:gridCol w:w="4680"/>
+        <w:gridCol w:w="4680"/>
+      </w:tblGrid>
+      <w:tr>
+        <w:tc>
+          <w:tcPr>
+            <w:tcW w:type="dxa" w:w="2160"/>
+            <w:shd w:fill="E8EEF5"/>
+            <w:tcMar>
+              <w:top w:w="80" w:type="dxa"/>
+              <w:start w:w="120" w:type="dxa"/>
+              <w:bottom w:w="80" w:type="dxa"/>
+              <w:end w:w="120" w:type="dxa"/>
+            </w:tcMar>
+            <w:vAlign w:val="center"/>
+          </w:tcPr>
+          <w:p>
+            <w:r>
+              <w:rPr>
+                <w:b/>
+              </w:rPr>
+              <w:t>Minute</w:t>
+            </w:r>
+          </w:p>
+        </w:tc>
+        <w:tc>
+          <w:tcPr>
+            <w:tcW w:type="dxa" w:w="7200"/>
+            <w:shd w:fill="E8EEF5"/>
+            <w:tcMar>
+              <w:top w:w="80" w:type="dxa"/>
+              <w:start w:w="120" w:type="dxa"/>
+              <w:bottom w:w="80" w:type="dxa"/>
+              <w:end w:w="120" w:type="dxa"/>
+            </w:tcMar>
+            <w:vAlign w:val="center"/>
+          </w:tcPr>
+          <w:p>
+            <w:r>
+              <w:rPr>
+                <w:b/>
+              </w:rPr>
+              <w:t>Proof</w:t>
+            </w:r>
+          </w:p>
+        </w:tc>
+      </w:tr>
+      <w:tr>
+        <w:tc>
+          <w:tcPr>
+            <w:tcW w:type="dxa" w:w="2160"/>
+            <w:tcMar>
+              <w:top w:w="80" w:type="dxa"/>
+              <w:start w:w="120" w:type="dxa"/>
+              <w:bottom w:w="80" w:type="dxa"/>
+              <w:end w:w="120" w:type="dxa"/>
+            </w:tcMar>
+            <w:vAlign w:val="center"/>
+          </w:tcPr>
+          <w:p>
+            <w:r>
+              <w:t>0:00-0:30</w:t>
+            </w:r>
+          </w:p>
+        </w:tc>
+        <w:tc>
+          <w:tcPr>
+            <w:tcW w:type="dxa" w:w="7200"/>
+            <w:tcMar>
+              <w:top w:w="80" w:type="dxa"/>
+              <w:start w:w="120" w:type="dxa"/>
+              <w:bottom w:w="80" w:type="dxa"/>
+              <w:end w:w="120" w:type="dxa"/>
+            </w:tcMar>
+            <w:vAlign w:val="center"/>
+          </w:tcPr>
+          <w:p>
+            <w:r>
+              <w:t>State the trust gap and run the unsafe deny path</w:t>
+            </w:r>
+          </w:p>
+        </w:tc>
+      </w:tr>
+      <w:tr>
+        <w:tc>
+          <w:tcPr>
+            <w:tcW w:type="dxa" w:w="2160"/>
+            <w:tcMar>
+              <w:top w:w="80" w:type="dxa"/>
+              <w:start w:w="120" w:type="dxa"/>
+              <w:bottom w:w="80" w:type="dxa"/>
+              <w:end w:w="120" w:type="dxa"/>
+            </w:tcMar>
+            <w:vAlign w:val="center"/>
+          </w:tcPr>
+          <w:p>
+            <w:r>
+              <w:t>0:30-1:10</w:t>
+            </w:r>
+          </w:p>
+        </w:tc>
+        <w:tc>
+          <w:tcPr>
+            <w:tcW w:type="dxa" w:w="7200"/>
+            <w:tcMar>
+              <w:top w:w="80" w:type="dxa"/>
+              <w:start w:w="120" w:type="dxa"/>
+              <w:bottom w:w="80" w:type="dxa"/>
+              <w:end w:w="120" w:type="dxa"/>
+            </w:tcMar>
+            <w:vAlign w:val="center"/>
+          </w:tcPr>
+          <w:p>
+            <w:r>
+              <w:t>Package the safe Codex skill and show receipt verification</w:t>
+            </w:r>
+          </w:p>
+        </w:tc>
+      </w:tr>
+      <w:tr>
+        <w:tc>
+          <w:tcPr>
+            <w:tcW w:type="dxa" w:w="2160"/>
+            <w:tcMar>
+              <w:top w:w="80" w:type="dxa"/>
+              <w:start w:w="120" w:type="dxa"/>
+              <w:bottom w:w="80" w:type="dxa"/>
+              <w:end w:w="120" w:type="dxa"/>
+            </w:tcMar>
+            <w:vAlign w:val="center"/>
+          </w:tcPr>
+          <w:p>
+            <w:r>
+              <w:t>1:10-1:50</w:t>
+            </w:r>
+          </w:p>
+        </w:tc>
+        <w:tc>
+          <w:tcPr>
+            <w:tcW w:type="dxa" w:w="7200"/>
+            <w:tcMar>
+              <w:top w:w="80" w:type="dxa"/>
+              <w:start w:w="120" w:type="dxa"/>
+              <w:bottom w:w="80" w:type="dxa"/>
+              <w:end w:w="120" w:type="dxa"/>
+            </w:tcMar>
+            <w:vAlign w:val="center"/>
+          </w:tcPr>
+          <w:p>
+            <w:r>
+              <w:t>Show wb status, workflows recommend, auto run --read-only</w:t>
+            </w:r>
+          </w:p>
+        </w:tc>
+      </w:tr>
+      <w:tr>
+        <w:tc>
+          <w:tcPr>
+            <w:tcW w:type="dxa" w:w="2160"/>
+            <w:tcMar>
+              <w:top w:w="80" w:type="dxa"/>
+              <w:start w:w="120" w:type="dxa"/>
+              <w:bottom w:w="80" w:type="dxa"/>
+              <w:end w:w="120" w:type="dxa"/>
+            </w:tcMar>
+            <w:vAlign w:val="center"/>
+          </w:tcPr>
+          <w:p>
+            <w:r>
+              <w:t>1:50-2:30</w:t>
+            </w:r>
+          </w:p>
+        </w:tc>
+        <w:tc>
+          <w:tcPr>
+            <w:tcW w:type="dxa" w:w="7200"/>
+            <w:tcMar>
+              <w:top w:w="80" w:type="dxa"/>
+              <w:start w:w="120" w:type="dxa"/>
+              <w:bottom w:w="80" w:type="dxa"/>
+              <w:end w:w="120" w:type="dxa"/>
+            </w:tcMar>
+            <w:vAlign w:val="center"/>
+          </w:tcPr>
+          <w:p>
+            <w:r>
+              <w:t>Open library HTML and AI index outputs</w:t>
+            </w:r>
+          </w:p>
+        </w:tc>
+      </w:tr>
+      <w:tr>
+        <w:tc>
+          <w:tcPr>
+            <w:tcW w:type="dxa" w:w="2160"/>
+            <w:tcMar>
+              <w:top w:w="80" w:type="dxa"/>
+              <w:start w:w="120" w:type="dxa"/>
+              <w:bottom w:w="80" w:type="dxa"/>
+              <w:end w:w="120" w:type="dxa"/>
+            </w:tcMar>
+            <w:vAlign w:val="center"/>
+          </w:tcPr>
+          <w:p>
+            <w:r>
+              <w:t>2:30-3:00</w:t>
+            </w:r>
+          </w:p>
+        </w:tc>
+        <w:tc>
+          <w:tcPr>
+            <w:tcW w:type="dxa" w:w="7200"/>
+            <w:tcMar>
+              <w:top w:w="80" w:type="dxa"/>
+              <w:start w:w="120" w:type="dxa"/>
+              <w:bottom w:w="80" w:type="dxa"/>
+              <w:end w:w="120" w:type="dxa"/>
+            </w:tcMar>
+            <w:vAlign w:val="center"/>
+          </w:tcPr>
+          <w:p>
+            <w:r>
+              <w:t>Show host boundaries, evidence bundle, and README poster/MP4</w:t>
+            </w:r>
+          </w:p>
+        </w:tc>
+      </w:tr>
+    </w:tbl>
+    <w:p/>
+    <w:p>
+      <w:pPr>
+        <w:pStyle w:val="Heading1"/>
+      </w:pPr>
+      <w:r>
+        <w:t>9. What Changed In This Pass</w:t>
+      </w:r>
+    </w:p>
+    <w:p>
+      <w:r>
+        <w:t>The pass added or verified the universal host story, local workbench commands, PowerShell wrappers, single-file library HTML, AI index HTML, read-only MCP recommendation tools, 100 dry-run workflows, expanded specialist agents, README/media cleanup, star map SVG, and this documentary. It also corrected stale MCP wording and added tests for wb --full and auto run safety.</w:t>
+      </w:r>
+    </w:p>
+    <w:p>
+      <w:r>
+        <w:t>The final repository state should be committed and pushed to the existing pull request after verification. The rollback path is normal git history on branch codex/hackathon-hardening-architecture.</w:t>
       </w:r>
     </w:p>
     <w:sectPr>
-      <w:headerReference w:type="default" r:id="rId9"/>
-      <w:footerReference w:type="default" r:id="rId10"/>
+      <w:footerReference w:type="default" r:id="rId9"/>
       <w:pgSz w:w="12240" w:h="15840"/>
       <w:pgMar w:top="1440" w:right="1440" w:bottom="1440" w:left="1440" w:header="708" w:footer="708" w:gutter="0"/>
       <w:cols w:space="720"/>
@@ -2317,28 +2382,10 @@
         <w:color w:val="666666"/>
         <w:sz w:val="18"/>
       </w:rPr>
-      <w:t>Generated locally from verified repository state. Unsigned internal project record.</w:t>
+      <w:t>SkillsForge hackathon documentary - generated from local repository evidence</w:t>
     </w:r>
   </w:p>
 </w:ftr>
-</file>
-
-<file path=word/header1.xml><?xml version="1.0" encoding="utf-8"?>
-<w:hdr xmlns:m="http://schemas.openxmlformats.org/officeDocument/2006/math" xmlns:mc="http://schemas.openxmlformats.org/markup-compatibility/2006" xmlns:mo="http://schemas.microsoft.com/office/mac/office/2008/main" xmlns:mv="urn:schemas-microsoft-com:mac:vml" xmlns:o="urn:schemas-microsoft-com:office:office" xmlns:r="http://schemas.openxmlformats.org/officeDocument/2006/relationships" xmlns:v="urn:schemas-microsoft-com:vml" xmlns:w10="urn:schemas-microsoft-com:office:word" xmlns:w14="http://schemas.microsoft.com/office/word/2010/wordml" xmlns:w="http://schemas.openxmlformats.org/wordprocessingml/2006/main" xmlns:wne="http://schemas.microsoft.com/office/word/2006/wordml" xmlns:wp14="http://schemas.microsoft.com/office/word/2010/wordprocessingDrawing" xmlns:wp="http://schemas.openxmlformats.org/drawingml/2006/wordprocessingDrawing" xmlns:wpc="http://schemas.microsoft.com/office/word/2010/wordprocessingCanvas" xmlns:wpg="http://schemas.microsoft.com/office/word/2010/wordprocessingGroup" xmlns:wpi="http://schemas.microsoft.com/office/word/2010/wordprocessingInk" xmlns:wps="http://schemas.microsoft.com/office/word/2010/wordprocessingShape" mc:Ignorable="w14 wp14">
-  <w:p>
-    <w:pPr>
-      <w:pStyle w:val="Header"/>
-      <w:jc w:val="right"/>
-    </w:pPr>
-    <w:r>
-      <w:rPr>
-        <w:color w:val="666666"/>
-        <w:sz w:val="18"/>
-      </w:rPr>
-      <w:t>SkillsForge Hackathon Build Documentary</w:t>
-    </w:r>
-  </w:p>
-</w:hdr>
 </file>
 
 <file path=word/numbering.xml><?xml version="1.0" encoding="utf-8"?>
@@ -2705,10 +2752,10 @@
     <w:qFormat/>
     <w:rsid w:val="00FC693F"/>
     <w:pPr>
-      <w:spacing w:after="120" w:line="264" w:lineRule="auto"/>
+      <w:spacing w:after="120" w:line="300" w:lineRule="auto"/>
     </w:pPr>
     <w:rPr>
-      <w:rFonts w:ascii="Calibri" w:hAnsi="Calibri" w:eastAsia="Calibri"/>
+      <w:rFonts w:ascii="Calibri" w:hAnsi="Calibri"/>
       <w:sz w:val="22"/>
     </w:rPr>
   </w:style>
@@ -2767,11 +2814,11 @@
     <w:pPr>
       <w:keepNext/>
       <w:keepLines/>
-      <w:spacing w:before="320" w:after="160"/>
+      <w:spacing w:before="360" w:after="200" w:line="300" w:lineRule="auto"/>
       <w:outlineLvl w:val="0"/>
     </w:pPr>
     <w:rPr>
-      <w:rFonts w:asciiTheme="majorHAnsi" w:eastAsiaTheme="majorEastAsia" w:hAnsiTheme="majorHAnsi" w:cstheme="majorBidi" w:ascii="Calibri" w:hAnsi="Calibri" w:eastAsia="Calibri"/>
+      <w:rFonts w:asciiTheme="majorHAnsi" w:eastAsiaTheme="majorEastAsia" w:hAnsiTheme="majorHAnsi" w:cstheme="majorBidi" w:ascii="Calibri" w:hAnsi="Calibri"/>
       <w:b/>
       <w:bCs/>
       <w:color w:val="2E74B5"/>
@@ -2791,11 +2838,11 @@
     <w:pPr>
       <w:keepNext/>
       <w:keepLines/>
-      <w:spacing w:before="240" w:after="120"/>
+      <w:spacing w:before="280" w:after="140" w:line="300" w:lineRule="auto"/>
       <w:outlineLvl w:val="1"/>
     </w:pPr>
     <w:rPr>
-      <w:rFonts w:asciiTheme="majorHAnsi" w:eastAsiaTheme="majorEastAsia" w:hAnsiTheme="majorHAnsi" w:cstheme="majorBidi" w:ascii="Calibri" w:hAnsi="Calibri" w:eastAsia="Calibri"/>
+      <w:rFonts w:asciiTheme="majorHAnsi" w:eastAsiaTheme="majorEastAsia" w:hAnsiTheme="majorHAnsi" w:cstheme="majorBidi" w:ascii="Calibri" w:hAnsi="Calibri"/>
       <w:b/>
       <w:bCs/>
       <w:color w:val="2E74B5"/>
@@ -2815,11 +2862,11 @@
     <w:pPr>
       <w:keepNext/>
       <w:keepLines/>
-      <w:spacing w:before="160" w:after="80"/>
+      <w:spacing w:before="200" w:after="100" w:line="300" w:lineRule="auto"/>
       <w:outlineLvl w:val="2"/>
     </w:pPr>
     <w:rPr>
-      <w:rFonts w:asciiTheme="majorHAnsi" w:eastAsiaTheme="majorEastAsia" w:hAnsiTheme="majorHAnsi" w:cstheme="majorBidi" w:ascii="Calibri" w:hAnsi="Calibri" w:eastAsia="Calibri"/>
+      <w:rFonts w:asciiTheme="majorHAnsi" w:eastAsiaTheme="majorEastAsia" w:hAnsiTheme="majorHAnsi" w:cstheme="majorBidi" w:ascii="Calibri" w:hAnsi="Calibri"/>
       <w:b/>
       <w:bCs/>
       <w:color w:val="1F4D78"/>
@@ -3239,13 +3286,8 @@
       <w:numPr>
         <w:numId w:val="1"/>
       </w:numPr>
-      <w:spacing w:after="120" w:line="280" w:lineRule="auto"/>
       <w:contextualSpacing/>
     </w:pPr>
-    <w:rPr>
-      <w:rFonts w:ascii="Calibri" w:hAnsi="Calibri"/>
-      <w:sz w:val="22"/>
-    </w:rPr>
   </w:style>
   <w:style w:type="paragraph" w:styleId="ListBullet2">
     <w:name w:val="List Bullet 2"/>
@@ -3283,13 +3325,8 @@
       <w:numPr>
         <w:numId w:val="5"/>
       </w:numPr>
-      <w:spacing w:after="120" w:line="280" w:lineRule="auto"/>
       <w:contextualSpacing/>
     </w:pPr>
-    <w:rPr>
-      <w:rFonts w:ascii="Calibri" w:hAnsi="Calibri"/>
-      <w:sz w:val="22"/>
-    </w:rPr>
   </w:style>
   <w:style w:type="paragraph" w:styleId="ListNumber2">
     <w:name w:val="List Number 2"/>

</xml_diff>